<commit_message>
Empaquetado con ajustes de DU  y PDF
</commit_message>
<xml_diff>
--- a/fuentes/CFA2_63220007_DU.docx
+++ b/fuentes/CFA2_63220007_DU.docx
@@ -85,7 +85,7 @@
               </wp:anchor>
             </w:drawing>
           </mc:Choice>
-          <mc:Fallback xmlns:w16sdtfl="http://schemas.microsoft.com/office/word/2024/wordml/sdtformatlock" xmlns:w16du="http://schemas.microsoft.com/office/word/2023/wordml/word16du" xmlns:oel="http://schemas.microsoft.com/office/2019/extlst">
+          <mc:Fallback xmlns:oel="http://schemas.microsoft.com/office/2019/extlst" xmlns:w16du="http://schemas.microsoft.com/office/word/2023/wordml/word16du" xmlns:w16sdtfl="http://schemas.microsoft.com/office/word/2024/wordml/sdtformatlock">
             <w:pict>
               <v:rect w14:anchorId="4E7873B1" id="Rectángulo 3" o:spid="_x0000_s1026" alt="&quot;&quot;" style="position:absolute;margin-left:-54pt;margin-top:31.65pt;width:613.85pt;height:204pt;z-index:-251655168;visibility:visible;mso-wrap-style:square;mso-height-percent:0;mso-wrap-distance-left:9pt;mso-wrap-distance-top:0;mso-wrap-distance-right:9pt;mso-wrap-distance-bottom:0;mso-position-horizontal:absolute;mso-position-horizontal-relative:text;mso-position-vertical:absolute;mso-position-vertical-relative:text;mso-height-percent:0;mso-height-relative:margin;v-text-anchor:middle" o:gfxdata="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" fillcolor="#00314d" stroked="f" strokeweight="1pt"/>
             </w:pict>
@@ -523,7 +523,7 @@
           <w:r>
             <w:fldChar w:fldCharType="separate"/>
           </w:r>
-          <w:hyperlink w:anchor="_Toc207623117" w:history="1">
+          <w:hyperlink w:anchor="_Toc208996115" w:history="1">
             <w:r>
               <w:rPr>
                 <w:rStyle w:val="Hipervnculo"/>
@@ -550,7 +550,7 @@
                 <w:noProof/>
                 <w:webHidden/>
               </w:rPr>
-              <w:instrText xml:space="preserve"> PAGEREF _Toc207623117 \h </w:instrText>
+              <w:instrText xml:space="preserve"> PAGEREF _Toc208996115 \h </w:instrText>
             </w:r>
             <w:r>
               <w:rPr>
@@ -597,7 +597,7 @@
               <w14:ligatures w14:val="none"/>
             </w:rPr>
           </w:pPr>
-          <w:hyperlink w:anchor="_Toc207623118" w:history="1">
+          <w:hyperlink w:anchor="_Toc208996116" w:history="1">
             <w:r>
               <w:rPr>
                 <w:rStyle w:val="Hipervnculo"/>
@@ -642,7 +642,7 @@
                 <w:noProof/>
                 <w:webHidden/>
               </w:rPr>
-              <w:instrText xml:space="preserve"> PAGEREF _Toc207623118 \h </w:instrText>
+              <w:instrText xml:space="preserve"> PAGEREF _Toc208996116 \h </w:instrText>
             </w:r>
             <w:r>
               <w:rPr>
@@ -689,7 +689,7 @@
               <w14:ligatures w14:val="none"/>
             </w:rPr>
           </w:pPr>
-          <w:hyperlink w:anchor="_Toc207623119" w:history="1">
+          <w:hyperlink w:anchor="_Toc208996117" w:history="1">
             <w:r>
               <w:rPr>
                 <w:rStyle w:val="Hipervnculo"/>
@@ -734,7 +734,7 @@
                 <w:noProof/>
                 <w:webHidden/>
               </w:rPr>
-              <w:instrText xml:space="preserve"> PAGEREF _Toc207623119 \h </w:instrText>
+              <w:instrText xml:space="preserve"> PAGEREF _Toc208996117 \h </w:instrText>
             </w:r>
             <w:r>
               <w:rPr>
@@ -777,7 +777,7 @@
               <w14:ligatures w14:val="none"/>
             </w:rPr>
           </w:pPr>
-          <w:hyperlink w:anchor="_Toc207623120" w:history="1">
+          <w:hyperlink w:anchor="_Toc208996118" w:history="1">
             <w:r>
               <w:rPr>
                 <w:rStyle w:val="Hipervnculo"/>
@@ -822,7 +822,7 @@
                 <w:noProof/>
                 <w:webHidden/>
               </w:rPr>
-              <w:instrText xml:space="preserve"> PAGEREF _Toc207623120 \h </w:instrText>
+              <w:instrText xml:space="preserve"> PAGEREF _Toc208996118 \h </w:instrText>
             </w:r>
             <w:r>
               <w:rPr>
@@ -865,7 +865,7 @@
               <w14:ligatures w14:val="none"/>
             </w:rPr>
           </w:pPr>
-          <w:hyperlink w:anchor="_Toc207623121" w:history="1">
+          <w:hyperlink w:anchor="_Toc208996119" w:history="1">
             <w:r>
               <w:rPr>
                 <w:rStyle w:val="Hipervnculo"/>
@@ -910,7 +910,7 @@
                 <w:noProof/>
                 <w:webHidden/>
               </w:rPr>
-              <w:instrText xml:space="preserve"> PAGEREF _Toc207623121 \h </w:instrText>
+              <w:instrText xml:space="preserve"> PAGEREF _Toc208996119 \h </w:instrText>
             </w:r>
             <w:r>
               <w:rPr>
@@ -957,7 +957,7 @@
               <w14:ligatures w14:val="none"/>
             </w:rPr>
           </w:pPr>
-          <w:hyperlink w:anchor="_Toc207623122" w:history="1">
+          <w:hyperlink w:anchor="_Toc208996120" w:history="1">
             <w:r>
               <w:rPr>
                 <w:rStyle w:val="Hipervnculo"/>
@@ -1002,7 +1002,7 @@
                 <w:noProof/>
                 <w:webHidden/>
               </w:rPr>
-              <w:instrText xml:space="preserve"> PAGEREF _Toc207623122 \h </w:instrText>
+              <w:instrText xml:space="preserve"> PAGEREF _Toc208996120 \h </w:instrText>
             </w:r>
             <w:r>
               <w:rPr>
@@ -1049,7 +1049,7 @@
               <w14:ligatures w14:val="none"/>
             </w:rPr>
           </w:pPr>
-          <w:hyperlink w:anchor="_Toc207623123" w:history="1">
+          <w:hyperlink w:anchor="_Toc208996121" w:history="1">
             <w:r>
               <w:rPr>
                 <w:rStyle w:val="Hipervnculo"/>
@@ -1094,7 +1094,7 @@
                 <w:noProof/>
                 <w:webHidden/>
               </w:rPr>
-              <w:instrText xml:space="preserve"> PAGEREF _Toc207623123 \h </w:instrText>
+              <w:instrText xml:space="preserve"> PAGEREF _Toc208996121 \h </w:instrText>
             </w:r>
             <w:r>
               <w:rPr>
@@ -1137,7 +1137,7 @@
               <w14:ligatures w14:val="none"/>
             </w:rPr>
           </w:pPr>
-          <w:hyperlink w:anchor="_Toc207623124" w:history="1">
+          <w:hyperlink w:anchor="_Toc208996122" w:history="1">
             <w:r>
               <w:rPr>
                 <w:rStyle w:val="Hipervnculo"/>
@@ -1182,7 +1182,7 @@
                 <w:noProof/>
                 <w:webHidden/>
               </w:rPr>
-              <w:instrText xml:space="preserve"> PAGEREF _Toc207623124 \h </w:instrText>
+              <w:instrText xml:space="preserve"> PAGEREF _Toc208996122 \h </w:instrText>
             </w:r>
             <w:r>
               <w:rPr>
@@ -1225,7 +1225,7 @@
               <w14:ligatures w14:val="none"/>
             </w:rPr>
           </w:pPr>
-          <w:hyperlink w:anchor="_Toc207623125" w:history="1">
+          <w:hyperlink w:anchor="_Toc208996123" w:history="1">
             <w:r>
               <w:rPr>
                 <w:rStyle w:val="Hipervnculo"/>
@@ -1270,7 +1270,7 @@
                 <w:noProof/>
                 <w:webHidden/>
               </w:rPr>
-              <w:instrText xml:space="preserve"> PAGEREF _Toc207623125 \h </w:instrText>
+              <w:instrText xml:space="preserve"> PAGEREF _Toc208996123 \h </w:instrText>
             </w:r>
             <w:r>
               <w:rPr>
@@ -1313,7 +1313,7 @@
               <w14:ligatures w14:val="none"/>
             </w:rPr>
           </w:pPr>
-          <w:hyperlink w:anchor="_Toc207623126" w:history="1">
+          <w:hyperlink w:anchor="_Toc208996124" w:history="1">
             <w:r>
               <w:rPr>
                 <w:rStyle w:val="Hipervnculo"/>
@@ -1358,7 +1358,7 @@
                 <w:noProof/>
                 <w:webHidden/>
               </w:rPr>
-              <w:instrText xml:space="preserve"> PAGEREF _Toc207623126 \h </w:instrText>
+              <w:instrText xml:space="preserve"> PAGEREF _Toc208996124 \h </w:instrText>
             </w:r>
             <w:r>
               <w:rPr>
@@ -1405,7 +1405,7 @@
               <w14:ligatures w14:val="none"/>
             </w:rPr>
           </w:pPr>
-          <w:hyperlink w:anchor="_Toc207623127" w:history="1">
+          <w:hyperlink w:anchor="_Toc208996125" w:history="1">
             <w:r>
               <w:rPr>
                 <w:rStyle w:val="Hipervnculo"/>
@@ -1450,7 +1450,7 @@
                 <w:noProof/>
                 <w:webHidden/>
               </w:rPr>
-              <w:instrText xml:space="preserve"> PAGEREF _Toc207623127 \h </w:instrText>
+              <w:instrText xml:space="preserve"> PAGEREF _Toc208996125 \h </w:instrText>
             </w:r>
             <w:r>
               <w:rPr>
@@ -1493,7 +1493,7 @@
               <w14:ligatures w14:val="none"/>
             </w:rPr>
           </w:pPr>
-          <w:hyperlink w:anchor="_Toc207623128" w:history="1">
+          <w:hyperlink w:anchor="_Toc208996126" w:history="1">
             <w:r>
               <w:rPr>
                 <w:rStyle w:val="Hipervnculo"/>
@@ -1538,7 +1538,7 @@
                 <w:noProof/>
                 <w:webHidden/>
               </w:rPr>
-              <w:instrText xml:space="preserve"> PAGEREF _Toc207623128 \h </w:instrText>
+              <w:instrText xml:space="preserve"> PAGEREF _Toc208996126 \h </w:instrText>
             </w:r>
             <w:r>
               <w:rPr>
@@ -1581,7 +1581,7 @@
               <w14:ligatures w14:val="none"/>
             </w:rPr>
           </w:pPr>
-          <w:hyperlink w:anchor="_Toc207623129" w:history="1">
+          <w:hyperlink w:anchor="_Toc208996127" w:history="1">
             <w:r>
               <w:rPr>
                 <w:rStyle w:val="Hipervnculo"/>
@@ -1626,7 +1626,7 @@
                 <w:noProof/>
                 <w:webHidden/>
               </w:rPr>
-              <w:instrText xml:space="preserve"> PAGEREF _Toc207623129 \h </w:instrText>
+              <w:instrText xml:space="preserve"> PAGEREF _Toc208996127 \h </w:instrText>
             </w:r>
             <w:r>
               <w:rPr>
@@ -1673,7 +1673,7 @@
               <w14:ligatures w14:val="none"/>
             </w:rPr>
           </w:pPr>
-          <w:hyperlink w:anchor="_Toc207623130" w:history="1">
+          <w:hyperlink w:anchor="_Toc208996128" w:history="1">
             <w:r>
               <w:rPr>
                 <w:rStyle w:val="Hipervnculo"/>
@@ -1718,7 +1718,7 @@
                 <w:noProof/>
                 <w:webHidden/>
               </w:rPr>
-              <w:instrText xml:space="preserve"> PAGEREF _Toc207623130 \h </w:instrText>
+              <w:instrText xml:space="preserve"> PAGEREF _Toc208996128 \h </w:instrText>
             </w:r>
             <w:r>
               <w:rPr>
@@ -1761,7 +1761,7 @@
               <w14:ligatures w14:val="none"/>
             </w:rPr>
           </w:pPr>
-          <w:hyperlink w:anchor="_Toc207623131" w:history="1">
+          <w:hyperlink w:anchor="_Toc208996129" w:history="1">
             <w:r>
               <w:rPr>
                 <w:rStyle w:val="Hipervnculo"/>
@@ -1806,7 +1806,7 @@
                 <w:noProof/>
                 <w:webHidden/>
               </w:rPr>
-              <w:instrText xml:space="preserve"> PAGEREF _Toc207623131 \h </w:instrText>
+              <w:instrText xml:space="preserve"> PAGEREF _Toc208996129 \h </w:instrText>
             </w:r>
             <w:r>
               <w:rPr>
@@ -1849,7 +1849,7 @@
               <w14:ligatures w14:val="none"/>
             </w:rPr>
           </w:pPr>
-          <w:hyperlink w:anchor="_Toc207623132" w:history="1">
+          <w:hyperlink w:anchor="_Toc208996130" w:history="1">
             <w:r>
               <w:rPr>
                 <w:rStyle w:val="Hipervnculo"/>
@@ -1894,7 +1894,7 @@
                 <w:noProof/>
                 <w:webHidden/>
               </w:rPr>
-              <w:instrText xml:space="preserve"> PAGEREF _Toc207623132 \h </w:instrText>
+              <w:instrText xml:space="preserve"> PAGEREF _Toc208996130 \h </w:instrText>
             </w:r>
             <w:r>
               <w:rPr>
@@ -1940,7 +1940,7 @@
               <w14:ligatures w14:val="none"/>
             </w:rPr>
           </w:pPr>
-          <w:hyperlink w:anchor="_Toc207623133" w:history="1">
+          <w:hyperlink w:anchor="_Toc208996131" w:history="1">
             <w:r>
               <w:rPr>
                 <w:rStyle w:val="Hipervnculo"/>
@@ -1967,7 +1967,7 @@
                 <w:noProof/>
                 <w:webHidden/>
               </w:rPr>
-              <w:instrText xml:space="preserve"> PAGEREF _Toc207623133 \h </w:instrText>
+              <w:instrText xml:space="preserve"> PAGEREF _Toc208996131 \h </w:instrText>
             </w:r>
             <w:r>
               <w:rPr>
@@ -2013,7 +2013,7 @@
               <w14:ligatures w14:val="none"/>
             </w:rPr>
           </w:pPr>
-          <w:hyperlink w:anchor="_Toc207623134" w:history="1">
+          <w:hyperlink w:anchor="_Toc208996132" w:history="1">
             <w:r>
               <w:rPr>
                 <w:rStyle w:val="Hipervnculo"/>
@@ -2040,7 +2040,7 @@
                 <w:noProof/>
                 <w:webHidden/>
               </w:rPr>
-              <w:instrText xml:space="preserve"> PAGEREF _Toc207623134 \h </w:instrText>
+              <w:instrText xml:space="preserve"> PAGEREF _Toc208996132 \h </w:instrText>
             </w:r>
             <w:r>
               <w:rPr>
@@ -2086,7 +2086,7 @@
               <w14:ligatures w14:val="none"/>
             </w:rPr>
           </w:pPr>
-          <w:hyperlink w:anchor="_Toc207623135" w:history="1">
+          <w:hyperlink w:anchor="_Toc208996133" w:history="1">
             <w:r>
               <w:rPr>
                 <w:rStyle w:val="Hipervnculo"/>
@@ -2113,7 +2113,7 @@
                 <w:noProof/>
                 <w:webHidden/>
               </w:rPr>
-              <w:instrText xml:space="preserve"> PAGEREF _Toc207623135 \h </w:instrText>
+              <w:instrText xml:space="preserve"> PAGEREF _Toc208996133 \h </w:instrText>
             </w:r>
             <w:r>
               <w:rPr>
@@ -2159,7 +2159,7 @@
               <w14:ligatures w14:val="none"/>
             </w:rPr>
           </w:pPr>
-          <w:hyperlink w:anchor="_Toc207623136" w:history="1">
+          <w:hyperlink w:anchor="_Toc208996134" w:history="1">
             <w:r>
               <w:rPr>
                 <w:rStyle w:val="Hipervnculo"/>
@@ -2186,7 +2186,7 @@
                 <w:noProof/>
                 <w:webHidden/>
               </w:rPr>
-              <w:instrText xml:space="preserve"> PAGEREF _Toc207623136 \h </w:instrText>
+              <w:instrText xml:space="preserve"> PAGEREF _Toc208996134 \h </w:instrText>
             </w:r>
             <w:r>
               <w:rPr>
@@ -2232,7 +2232,7 @@
               <w14:ligatures w14:val="none"/>
             </w:rPr>
           </w:pPr>
-          <w:hyperlink w:anchor="_Toc207623137" w:history="1">
+          <w:hyperlink w:anchor="_Toc208996135" w:history="1">
             <w:r>
               <w:rPr>
                 <w:rStyle w:val="Hipervnculo"/>
@@ -2259,7 +2259,7 @@
                 <w:noProof/>
                 <w:webHidden/>
               </w:rPr>
-              <w:instrText xml:space="preserve"> PAGEREF _Toc207623137 \h </w:instrText>
+              <w:instrText xml:space="preserve"> PAGEREF _Toc208996135 \h </w:instrText>
             </w:r>
             <w:r>
               <w:rPr>
@@ -2324,7 +2324,7 @@
       <w:pPr>
         <w:pStyle w:val="Titulosgenerales"/>
       </w:pPr>
-      <w:bookmarkStart w:id="0" w:name="_Toc207623117"/>
+      <w:bookmarkStart w:id="0" w:name="_Toc208996115"/>
       <w:r>
         <w:lastRenderedPageBreak/>
         <w:t>Introducción</w:t>
@@ -2347,7 +2347,16 @@
         <w:t>marketing</w:t>
       </w:r>
       <w:r>
-        <w:t xml:space="preserve"> digital.</w:t>
+        <w:t xml:space="preserve"> </w:t>
+      </w:r>
+      <w:r>
+        <w:rPr>
+          <w:rStyle w:val="Extranjerismo"/>
+        </w:rPr>
+        <w:t>digital</w:t>
+      </w:r>
+      <w:r>
+        <w:t>.</w:t>
       </w:r>
     </w:p>
     <w:p>
@@ -2370,7 +2379,13 @@
     </w:p>
     <w:p>
       <w:r>
-        <w:t xml:space="preserve">               </w:t>
+        <w:t xml:space="preserve">             </w:t>
+      </w:r>
+      <w:r>
+        <w:t xml:space="preserve">     </w:t>
+      </w:r>
+      <w:r>
+        <w:t xml:space="preserve">  </w:t>
       </w:r>
       <w:r>
         <w:rPr>
@@ -2441,27 +2456,36 @@
       <w:pPr>
         <w:ind w:firstLine="0"/>
         <w:rPr>
-          <w:noProof/>
-        </w:rPr>
-      </w:pPr>
-      <w:r>
-        <w:rPr>
-          <w:noProof/>
-        </w:rPr>
-        <w:lastRenderedPageBreak/>
-        <w:t xml:space="preserve">                    </w:t>
-      </w:r>
-    </w:p>
-    <w:p>
-      <w:pPr>
-        <w:ind w:firstLine="0"/>
-        <w:jc w:val="center"/>
-        <w:rPr>
           <w:b/>
           <w:u w:val="single"/>
           <w:lang w:val="es-419"/>
         </w:rPr>
       </w:pPr>
+      <w:r>
+        <w:rPr>
+          <w:noProof/>
+        </w:rPr>
+        <w:lastRenderedPageBreak/>
+        <w:t xml:space="preserve">                    </w:t>
+      </w:r>
+      <w:r>
+        <w:rPr>
+          <w:noProof/>
+        </w:rPr>
+        <w:tab/>
+      </w:r>
+      <w:r>
+        <w:rPr>
+          <w:noProof/>
+        </w:rPr>
+        <w:tab/>
+      </w:r>
+      <w:r>
+        <w:rPr>
+          <w:noProof/>
+        </w:rPr>
+        <w:tab/>
+      </w:r>
       <w:hyperlink r:id="rId14" w:history="1">
         <w:r>
           <w:rPr>
@@ -2616,9 +2640,16 @@
     </w:p>
     <w:p>
       <w:pPr>
+        <w:rPr>
+          <w:lang w:val="es-419" w:eastAsia="es-CO"/>
+        </w:rPr>
+      </w:pPr>
+    </w:p>
+    <w:p>
+      <w:pPr>
         <w:pStyle w:val="Ttulo1"/>
       </w:pPr>
-      <w:bookmarkStart w:id="1" w:name="_Toc207623118"/>
+      <w:bookmarkStart w:id="1" w:name="_Toc208996116"/>
       <w:r>
         <w:lastRenderedPageBreak/>
         <w:t>Analítica web</w:t>
@@ -2826,7 +2857,7 @@
         <w:rPr>
           <w:lang w:val="es-419" w:eastAsia="es-CO"/>
         </w:rPr>
-        <w:t xml:space="preserve">                                     </w:t>
+        <w:t xml:space="preserve">                           </w:t>
       </w:r>
       <w:r>
         <w:rPr>
@@ -2834,9 +2865,9 @@
           <w:lang w:val="es-419" w:eastAsia="es-CO"/>
         </w:rPr>
         <w:drawing>
-          <wp:inline distT="0" distB="0" distL="0" distR="0" wp14:anchorId="14A1E3D2" wp14:editId="49471BBC">
-            <wp:extent cx="3153091" cy="3848100"/>
-            <wp:effectExtent l="0" t="0" r="9525" b="0"/>
+          <wp:inline distT="0" distB="0" distL="0" distR="0" wp14:anchorId="14A1E3D2" wp14:editId="0CDD7F14">
+            <wp:extent cx="4203865" cy="5130488"/>
+            <wp:effectExtent l="0" t="0" r="6350" b="0"/>
             <wp:docPr id="4" name="Imagen 4" descr="La figura presenta las características de la analítica web.&#10;Permite identificar tendencias de comportamiento de los usuarios.&#10;Facilita la medición de la efectividad de estrategias digitales.&#10;Proporciona datos para la optimización de contenidos.&#10;Ayuda a mejorar la experiencia del usuario en plataformas digitales.&#10;"/>
             <wp:cNvGraphicFramePr>
               <a:graphicFrameLocks xmlns:a="http://schemas.openxmlformats.org/drawingml/2006/main" noChangeAspect="1"/>
@@ -2863,7 +2894,7 @@
                   <pic:spPr>
                     <a:xfrm>
                       <a:off x="0" y="0"/>
-                      <a:ext cx="3159862" cy="3856363"/>
+                      <a:ext cx="4221181" cy="5151620"/>
                     </a:xfrm>
                     <a:prstGeom prst="rect">
                       <a:avLst/>
@@ -2978,6 +3009,7 @@
           <w:szCs w:val="28"/>
           <w:lang w:val="es-419"/>
         </w:rPr>
+        <w:lastRenderedPageBreak/>
         <w:t>Son múltiples los beneficios de la analítica web en redes sociales, algunos de ellos son la segmentación precisa, la cual permite conocer el perfil de la audiencia y adaptar estrategias, la optimización del contenido que ayuda a identificar qué tipo de publicaciones generan más interacción y la medición del retorno de inversión (ROI) que facilita la evaluación del impacto de campañas digitales.</w:t>
       </w:r>
     </w:p>
@@ -2997,7 +3029,6 @@
           <w:szCs w:val="28"/>
           <w:lang w:val="es-419"/>
         </w:rPr>
-        <w:lastRenderedPageBreak/>
         <w:t>Ejemplo empresarial</w:t>
       </w:r>
       <w:r>
@@ -3028,7 +3059,7 @@
       <w:pPr>
         <w:pStyle w:val="Ttulo1"/>
       </w:pPr>
-      <w:bookmarkStart w:id="2" w:name="_Toc207623119"/>
+      <w:bookmarkStart w:id="2" w:name="_Toc208996117"/>
       <w:r>
         <w:lastRenderedPageBreak/>
         <w:t>Métricas</w:t>
@@ -3475,18 +3506,6 @@
                 <w:lang w:val="es-CO"/>
               </w:rPr>
             </w:pPr>
-            <w:proofErr w:type="spellStart"/>
-            <w:r>
-              <w:rPr>
-                <w:rStyle w:val="Extranjerismo"/>
-                <w:rFonts w:asciiTheme="minorHAnsi" w:hAnsiTheme="minorHAnsi"/>
-                <w:sz w:val="28"/>
-                <w:szCs w:val="28"/>
-                <w:lang w:val="es-CO"/>
-              </w:rPr>
-              <w:t>Clicks</w:t>
-            </w:r>
-            <w:proofErr w:type="spellEnd"/>
             <w:r>
               <w:rPr>
                 <w:rFonts w:asciiTheme="minorHAnsi" w:hAnsiTheme="minorHAnsi" w:cstheme="minorHAnsi"/>
@@ -3494,7 +3513,16 @@
                 <w:szCs w:val="28"/>
                 <w:lang w:val="es-CO"/>
               </w:rPr>
-              <w:t xml:space="preserve"> por enlace.</w:t>
+              <w:t xml:space="preserve">Clic </w:t>
+            </w:r>
+            <w:r>
+              <w:rPr>
+                <w:rFonts w:asciiTheme="minorHAnsi" w:hAnsiTheme="minorHAnsi" w:cstheme="minorHAnsi"/>
+                <w:sz w:val="28"/>
+                <w:szCs w:val="28"/>
+                <w:lang w:val="es-CO"/>
+              </w:rPr>
+              <w:t>por enlace.</w:t>
             </w:r>
           </w:p>
         </w:tc>
@@ -3519,20 +3547,26 @@
                 <w:szCs w:val="28"/>
                 <w:lang w:val="es-CO"/>
               </w:rPr>
-              <w:t xml:space="preserve">Registra los </w:t>
-            </w:r>
-            <w:proofErr w:type="spellStart"/>
-            <w:r>
-              <w:rPr>
-                <w:rStyle w:val="Extranjerismo"/>
-                <w:rFonts w:asciiTheme="minorHAnsi" w:hAnsiTheme="minorHAnsi"/>
-                <w:sz w:val="28"/>
-                <w:szCs w:val="28"/>
-                <w:lang w:val="es-CO"/>
-              </w:rPr>
-              <w:t>clicks</w:t>
-            </w:r>
-            <w:proofErr w:type="spellEnd"/>
+              <w:t xml:space="preserve">Registra </w:t>
+            </w:r>
+            <w:r>
+              <w:rPr>
+                <w:rFonts w:asciiTheme="minorHAnsi" w:hAnsiTheme="minorHAnsi" w:cstheme="minorHAnsi"/>
+                <w:sz w:val="28"/>
+                <w:szCs w:val="28"/>
+                <w:lang w:val="es-CO"/>
+              </w:rPr>
+              <w:t>los</w:t>
+            </w:r>
+            <w:r>
+              <w:rPr>
+                <w:rFonts w:asciiTheme="minorHAnsi" w:hAnsiTheme="minorHAnsi" w:cstheme="minorHAnsi"/>
+                <w:sz w:val="28"/>
+                <w:szCs w:val="28"/>
+                <w:lang w:val="es-CO"/>
+              </w:rPr>
+              <w:t xml:space="preserve"> clics</w:t>
+            </w:r>
             <w:r>
               <w:rPr>
                 <w:rFonts w:asciiTheme="minorHAnsi" w:hAnsiTheme="minorHAnsi" w:cstheme="minorHAnsi"/>
@@ -3586,7 +3620,6 @@
               </w:rPr>
               <w:t xml:space="preserve">recibió 150 </w:t>
             </w:r>
-            <w:proofErr w:type="spellStart"/>
             <w:r>
               <w:rPr>
                 <w:rStyle w:val="Extranjerismo"/>
@@ -3595,9 +3628,18 @@
                 <w:szCs w:val="28"/>
                 <w:lang w:val="es-CO"/>
               </w:rPr>
-              <w:t>clicks</w:t>
-            </w:r>
-            <w:proofErr w:type="spellEnd"/>
+              <w:t>clic</w:t>
+            </w:r>
+            <w:r>
+              <w:rPr>
+                <w:rStyle w:val="Extranjerismo"/>
+                <w:rFonts w:asciiTheme="minorHAnsi" w:hAnsiTheme="minorHAnsi"/>
+                <w:sz w:val="28"/>
+                <w:szCs w:val="28"/>
+                <w:lang w:val="es-CO"/>
+              </w:rPr>
+              <w:t>s</w:t>
+            </w:r>
             <w:r>
               <w:rPr>
                 <w:rFonts w:asciiTheme="minorHAnsi" w:hAnsiTheme="minorHAnsi" w:cstheme="minorHAnsi"/>
@@ -3793,20 +3835,17 @@
                 <w:szCs w:val="28"/>
                 <w:lang w:val="es-CO"/>
               </w:rPr>
-              <w:t xml:space="preserve">CPC (Costo por </w:t>
-            </w:r>
-            <w:proofErr w:type="spellStart"/>
-            <w:r>
-              <w:rPr>
-                <w:rStyle w:val="Extranjerismo"/>
-                <w:rFonts w:asciiTheme="minorHAnsi" w:hAnsiTheme="minorHAnsi"/>
-                <w:sz w:val="28"/>
-                <w:szCs w:val="28"/>
-                <w:lang w:val="es-CO"/>
-              </w:rPr>
-              <w:t>Click</w:t>
-            </w:r>
-            <w:proofErr w:type="spellEnd"/>
+              <w:t>CPC (Costo por</w:t>
+            </w:r>
+            <w:r>
+              <w:rPr>
+                <w:rFonts w:asciiTheme="minorHAnsi" w:hAnsiTheme="minorHAnsi" w:cstheme="minorHAnsi"/>
+                <w:sz w:val="28"/>
+                <w:szCs w:val="28"/>
+                <w:lang w:val="es-CO"/>
+              </w:rPr>
+              <w:t xml:space="preserve"> Clic</w:t>
+            </w:r>
             <w:r>
               <w:rPr>
                 <w:rFonts w:asciiTheme="minorHAnsi" w:hAnsiTheme="minorHAnsi" w:cstheme="minorHAnsi"/>
@@ -3841,7 +3880,6 @@
               </w:rPr>
               <w:t xml:space="preserve">Determina el costo monetario por cada </w:t>
             </w:r>
-            <w:proofErr w:type="spellStart"/>
             <w:r>
               <w:rPr>
                 <w:rStyle w:val="Extranjerismo"/>
@@ -3850,9 +3888,8 @@
                 <w:szCs w:val="28"/>
                 <w:lang w:val="es-CO"/>
               </w:rPr>
-              <w:t>click</w:t>
-            </w:r>
-            <w:proofErr w:type="spellEnd"/>
+              <w:t>clic</w:t>
+            </w:r>
             <w:r>
               <w:rPr>
                 <w:rFonts w:asciiTheme="minorHAnsi" w:hAnsiTheme="minorHAnsi" w:cstheme="minorHAnsi"/>
@@ -3885,20 +3922,17 @@
                 <w:szCs w:val="28"/>
                 <w:lang w:val="es-CO"/>
               </w:rPr>
-              <w:t xml:space="preserve">"$0.20 por clic (100 </w:t>
-            </w:r>
-            <w:proofErr w:type="spellStart"/>
-            <w:r>
-              <w:rPr>
-                <w:rStyle w:val="Extranjerismo"/>
-                <w:rFonts w:asciiTheme="minorHAnsi" w:hAnsiTheme="minorHAnsi"/>
-                <w:sz w:val="28"/>
-                <w:szCs w:val="28"/>
-                <w:lang w:val="es-CO"/>
-              </w:rPr>
-              <w:t>clicks</w:t>
-            </w:r>
-            <w:proofErr w:type="spellEnd"/>
+              <w:t>"$0.20 por clic (100</w:t>
+            </w:r>
+            <w:r>
+              <w:rPr>
+                <w:rFonts w:asciiTheme="minorHAnsi" w:hAnsiTheme="minorHAnsi" w:cstheme="minorHAnsi"/>
+                <w:sz w:val="28"/>
+                <w:szCs w:val="28"/>
+                <w:lang w:val="es-CO"/>
+              </w:rPr>
+              <w:t xml:space="preserve"> clics</w:t>
+            </w:r>
             <w:r>
               <w:rPr>
                 <w:rFonts w:asciiTheme="minorHAnsi" w:hAnsiTheme="minorHAnsi" w:cstheme="minorHAnsi"/>
@@ -5100,7 +5134,7 @@
       <w:pPr>
         <w:pStyle w:val="Ttulo2"/>
       </w:pPr>
-      <w:bookmarkStart w:id="3" w:name="_Toc207623120"/>
+      <w:bookmarkStart w:id="3" w:name="_Toc208996118"/>
       <w:r>
         <w:t>Importancia</w:t>
       </w:r>
@@ -5223,7 +5257,7 @@
       <w:pPr>
         <w:pStyle w:val="Ttulo2"/>
       </w:pPr>
-      <w:bookmarkStart w:id="4" w:name="_Toc207623121"/>
+      <w:bookmarkStart w:id="4" w:name="_Toc208996119"/>
       <w:r>
         <w:t>Tipo</w:t>
       </w:r>
@@ -5607,17 +5641,20 @@
         <w:rPr>
           <w:lang w:val="es-419" w:eastAsia="es-CO"/>
         </w:rPr>
-        <w:t xml:space="preserve">, comentarios, compartidos y </w:t>
-      </w:r>
-      <w:proofErr w:type="spellStart"/>
-      <w:r>
-        <w:rPr>
-          <w:rStyle w:val="Extranjerismo"/>
-          <w:lang w:val="es-419" w:eastAsia="es-CO"/>
-        </w:rPr>
-        <w:t>clicks</w:t>
-      </w:r>
-      <w:proofErr w:type="spellEnd"/>
+        <w:t>, comentarios, compartidos y</w:t>
+      </w:r>
+      <w:r>
+        <w:rPr>
+          <w:lang w:val="es-419" w:eastAsia="es-CO"/>
+        </w:rPr>
+        <w:t xml:space="preserve"> clic</w:t>
+      </w:r>
+      <w:r>
+        <w:rPr>
+          <w:lang w:val="es-419" w:eastAsia="es-CO"/>
+        </w:rPr>
+        <w:t>s</w:t>
+      </w:r>
       <w:r>
         <w:rPr>
           <w:lang w:val="es-419" w:eastAsia="es-CO"/>
@@ -5793,9 +5830,16 @@
     </w:p>
     <w:p>
       <w:pPr>
+        <w:rPr>
+          <w:lang w:val="es-419" w:eastAsia="es-CO"/>
+        </w:rPr>
+      </w:pPr>
+    </w:p>
+    <w:p>
+      <w:pPr>
         <w:pStyle w:val="Ttulo1"/>
       </w:pPr>
-      <w:bookmarkStart w:id="5" w:name="_Toc207623122"/>
+      <w:bookmarkStart w:id="5" w:name="_Toc208996120"/>
       <w:r>
         <w:lastRenderedPageBreak/>
         <w:t>Redes sociales</w:t>
@@ -5818,15 +5862,26 @@
       <w:r>
         <w:rPr>
           <w:rStyle w:val="Extranjerismo"/>
-          <w:lang w:val="es-419" w:eastAsia="es-CO"/>
-        </w:rPr>
-        <w:t>marketing</w:t>
-      </w:r>
-      <w:r>
-        <w:rPr>
-          <w:lang w:val="es-419" w:eastAsia="es-CO"/>
-        </w:rPr>
-        <w:t xml:space="preserve"> digital, su poder radica en que permiten activar estrategias medibles, segmentadas y alineadas con objetivos SMART: específicos, medibles, alcanzables, relevantes y temporales. Ya no se trata solo de publicar por estar, sino de diseñar contenidos que respondan a metas claras como aumentar el tráfico web en un 20 % en tres meses o generar 50 </w:t>
+        </w:rPr>
+        <w:t>marketing digital</w:t>
+      </w:r>
+      <w:r>
+        <w:rPr>
+          <w:lang w:val="es-419" w:eastAsia="es-CO"/>
+        </w:rPr>
+        <w:t>, su poder radica</w:t>
+      </w:r>
+      <w:r>
+        <w:rPr>
+          <w:lang w:val="es-419" w:eastAsia="es-CO"/>
+        </w:rPr>
+        <w:t xml:space="preserve"> </w:t>
+      </w:r>
+      <w:r>
+        <w:rPr>
+          <w:lang w:val="es-419" w:eastAsia="es-CO"/>
+        </w:rPr>
+        <w:t xml:space="preserve">en que permiten activar estrategias medibles, segmentadas y alineadas con objetivos SMART: específicos, medibles, alcanzables, relevantes y temporales. Ya no se trata solo de publicar por estar, sino de diseñar contenidos que respondan a metas claras como aumentar el tráfico web en un 20 % en tres meses o generar 50 </w:t>
       </w:r>
       <w:r>
         <w:rPr>
@@ -5869,15 +5924,14 @@
       <w:r>
         <w:rPr>
           <w:rStyle w:val="Extranjerismo"/>
-          <w:lang w:val="es-419" w:eastAsia="es-CO"/>
-        </w:rPr>
-        <w:t>marketing</w:t>
-      </w:r>
-      <w:r>
-        <w:rPr>
-          <w:lang w:val="es-419" w:eastAsia="es-CO"/>
-        </w:rPr>
-        <w:t xml:space="preserve"> digital son aquellos que cumplen con las siguientes características:</w:t>
+        </w:rPr>
+        <w:t>marketing digital</w:t>
+      </w:r>
+      <w:r>
+        <w:rPr>
+          <w:lang w:val="es-419" w:eastAsia="es-CO"/>
+        </w:rPr>
+        <w:t xml:space="preserve"> son aquellos que cumplen con las siguientes características:</w:t>
       </w:r>
     </w:p>
     <w:p>
@@ -6115,15 +6169,14 @@
       <w:r>
         <w:rPr>
           <w:rStyle w:val="Extranjerismo"/>
-          <w:lang w:val="es-419" w:eastAsia="es-CO"/>
-        </w:rPr>
-        <w:t>marketing</w:t>
-      </w:r>
-      <w:r>
-        <w:rPr>
-          <w:lang w:val="es-419" w:eastAsia="es-CO"/>
-        </w:rPr>
-        <w:t xml:space="preserve"> digital son fundamentales para asegurar estrategias efectivas y con propósito. Definir metas específicas permite enfocarse en lo que realmente se quiere lograr, mientras que la capacidad de medir resultados con datos concretos evita la improvisación. Es clave que sean alcanzables y realistas dentro de los recursos disponibles, además de alinearse con la estrategia del negocio para </w:t>
+        </w:rPr>
+        <w:t>marketing digital</w:t>
+      </w:r>
+      <w:r>
+        <w:rPr>
+          <w:lang w:val="es-419" w:eastAsia="es-CO"/>
+        </w:rPr>
+        <w:t xml:space="preserve"> son fundamentales para asegurar estrategias efectivas y con propósito. Definir metas específicas permite enfocarse en lo que realmente se quiere lograr, mientras que la capacidad de medir resultados con datos concretos evita la improvisación. Es clave que sean alcanzables y realistas dentro de los recursos disponibles, además de alinearse con la estrategia del negocio para </w:t>
       </w:r>
       <w:r>
         <w:rPr>
@@ -6310,7 +6363,7 @@
       <w:pPr>
         <w:pStyle w:val="Ttulo1"/>
       </w:pPr>
-      <w:bookmarkStart w:id="6" w:name="_Toc207623123"/>
+      <w:bookmarkStart w:id="6" w:name="_Toc208996121"/>
       <w:r>
         <w:lastRenderedPageBreak/>
         <w:t>Estándares</w:t>
@@ -6348,7 +6401,7 @@
       <w:pPr>
         <w:pStyle w:val="Ttulo2"/>
       </w:pPr>
-      <w:bookmarkStart w:id="7" w:name="_Toc207623124"/>
+      <w:bookmarkStart w:id="7" w:name="_Toc208996122"/>
       <w:r>
         <w:t>Aplicación</w:t>
       </w:r>
@@ -6495,22 +6548,131 @@
           <w:lang w:val="es-419" w:eastAsia="es-CO"/>
         </w:rPr>
       </w:pPr>
-    </w:p>
-    <w:p>
-      <w:pPr>
-        <w:rPr>
-          <w:lang w:val="es-419" w:eastAsia="es-CO"/>
-        </w:rPr>
-      </w:pPr>
       <w:r>
         <w:rPr>
           <w:b/>
           <w:bCs/>
           <w:lang w:val="es-419" w:eastAsia="es-CO"/>
         </w:rPr>
+        <w:t>Ejemplo empresarial</w:t>
+      </w:r>
+      <w:r>
+        <w:rPr>
+          <w:lang w:val="es-419" w:eastAsia="es-CO"/>
+        </w:rPr>
+        <w:t>.</w:t>
+      </w:r>
+      <w:r>
+        <w:rPr>
+          <w:lang w:val="es-419" w:eastAsia="es-CO"/>
+        </w:rPr>
+        <w:t xml:space="preserve"> Una agencia de </w:t>
+      </w:r>
+      <w:r>
+        <w:rPr>
+          <w:rStyle w:val="Extranjerismo"/>
+          <w:lang w:val="es-419" w:eastAsia="es-CO"/>
+        </w:rPr>
+        <w:t>marketing</w:t>
+      </w:r>
+      <w:r>
+        <w:rPr>
+          <w:lang w:val="es-419" w:eastAsia="es-CO"/>
+        </w:rPr>
+        <w:t xml:space="preserve"> utiliza estándares de analítica web para evaluar la tasa de conversión de sus anuncios en Facebook, siguiendo </w:t>
+      </w:r>
+      <w:r>
+        <w:rPr>
+          <w:lang w:val="es-419" w:eastAsia="es-CO"/>
+        </w:rPr>
         <w:lastRenderedPageBreak/>
-        <w:t>Ejemplo empresarial</w:t>
-      </w:r>
+        <w:t>principios de medición, determina que ciertos formatos de anuncios generan mejores resultados, lo que le permite optimizar sus campañas futuras.</w:t>
+      </w:r>
+    </w:p>
+    <w:p>
+      <w:pPr>
+        <w:pStyle w:val="Ttulo2"/>
+      </w:pPr>
+      <w:bookmarkStart w:id="8" w:name="_Toc208996123"/>
+      <w:r>
+        <w:t>Interpretación</w:t>
+      </w:r>
+      <w:bookmarkEnd w:id="8"/>
+    </w:p>
+    <w:p>
+      <w:pPr>
+        <w:rPr>
+          <w:lang w:val="es-419" w:eastAsia="es-CO"/>
+        </w:rPr>
+      </w:pPr>
+      <w:r>
+        <w:rPr>
+          <w:lang w:val="es-419" w:eastAsia="es-CO"/>
+        </w:rPr>
+        <w:t xml:space="preserve">La recopilación de datos es solo el primer paso en el proceso de obtener información valiosa, sin una interpretación adecuada, los datos siguen siendo cifras y registros sin un propósito claro. La generación de </w:t>
+      </w:r>
+      <w:proofErr w:type="spellStart"/>
+      <w:r>
+        <w:rPr>
+          <w:rStyle w:val="Extranjerismo"/>
+          <w:lang w:val="es-419" w:eastAsia="es-CO"/>
+        </w:rPr>
+        <w:t>insights</w:t>
+      </w:r>
+      <w:proofErr w:type="spellEnd"/>
+      <w:r>
+        <w:rPr>
+          <w:lang w:val="es-419" w:eastAsia="es-CO"/>
+        </w:rPr>
+        <w:t xml:space="preserve"> implica analizar patrones en la información obtenida para transformar los datos en conocimiento accionable (Muñoz &amp; Elosegui, 2018). La clave está en analizarlos con profundidad, identificar tendencias y reconocer patrones que ayuden a comprender mejor el comportamiento de los usuarios, el mercado y las oportunidades de negocio. </w:t>
+      </w:r>
+    </w:p>
+    <w:p>
+      <w:pPr>
+        <w:rPr>
+          <w:lang w:val="es-419" w:eastAsia="es-CO"/>
+        </w:rPr>
+      </w:pPr>
+      <w:r>
+        <w:rPr>
+          <w:lang w:val="es-419" w:eastAsia="es-CO"/>
+        </w:rPr>
+        <w:t>Le invitamos a</w:t>
+      </w:r>
+      <w:r>
+        <w:rPr>
+          <w:lang w:val="es-419" w:eastAsia="es-CO"/>
+        </w:rPr>
+        <w:t xml:space="preserve"> </w:t>
+      </w:r>
+      <w:r>
+        <w:rPr>
+          <w:lang w:val="es-419" w:eastAsia="es-CO"/>
+        </w:rPr>
+        <w:t>explorar</w:t>
+      </w:r>
+      <w:r>
+        <w:rPr>
+          <w:lang w:val="es-419" w:eastAsia="es-CO"/>
+        </w:rPr>
+        <w:t xml:space="preserve"> el siguiente video por medio del cual podrá apreciar un poco más al detalle sobre los</w:t>
+      </w:r>
+      <w:r>
+        <w:rPr>
+          <w:lang w:val="es-419" w:eastAsia="es-CO"/>
+        </w:rPr>
+        <w:t xml:space="preserve"> </w:t>
+      </w:r>
+      <w:proofErr w:type="spellStart"/>
+      <w:r>
+        <w:rPr>
+          <w:rStyle w:val="Extranjerismo"/>
+          <w:u w:val="single"/>
+          <w:lang w:val="es-419" w:eastAsia="es-CO"/>
+        </w:rPr>
+        <w:t>insight</w:t>
+      </w:r>
+      <w:proofErr w:type="spellEnd"/>
       <w:r>
         <w:rPr>
           <w:lang w:val="es-419" w:eastAsia="es-CO"/>
@@ -6521,110 +6683,19 @@
         <w:rPr>
           <w:lang w:val="es-419" w:eastAsia="es-CO"/>
         </w:rPr>
-        <w:t xml:space="preserve"> Una agencia de </w:t>
-      </w:r>
-      <w:r>
-        <w:rPr>
-          <w:rStyle w:val="Extranjerismo"/>
-          <w:lang w:val="es-419" w:eastAsia="es-CO"/>
-        </w:rPr>
-        <w:t>marketing</w:t>
-      </w:r>
-      <w:r>
-        <w:rPr>
-          <w:lang w:val="es-419" w:eastAsia="es-CO"/>
-        </w:rPr>
-        <w:t xml:space="preserve"> utiliza estándares de analítica web para evaluar la tasa de conversión de sus anuncios en Facebook, siguiendo principios de medición, determina que ciertos formatos de anuncios generan mejores resultados, lo que le permite optimizar sus campañas futuras.</w:t>
-      </w:r>
-    </w:p>
-    <w:p>
-      <w:pPr>
-        <w:pStyle w:val="Ttulo2"/>
-      </w:pPr>
-      <w:bookmarkStart w:id="8" w:name="_Toc207623125"/>
-      <w:r>
-        <w:t>Interpretación</w:t>
-      </w:r>
-      <w:bookmarkEnd w:id="8"/>
-    </w:p>
-    <w:p>
-      <w:pPr>
-        <w:rPr>
-          <w:lang w:val="es-419" w:eastAsia="es-CO"/>
-        </w:rPr>
-      </w:pPr>
-      <w:r>
-        <w:rPr>
-          <w:lang w:val="es-419" w:eastAsia="es-CO"/>
-        </w:rPr>
-        <w:t xml:space="preserve">La recopilación de datos es solo el primer paso en el proceso de obtener información valiosa, sin una interpretación adecuada, los datos siguen siendo cifras y registros sin un propósito claro. La generación de </w:t>
-      </w:r>
-      <w:proofErr w:type="spellStart"/>
-      <w:r>
-        <w:rPr>
-          <w:rStyle w:val="Extranjerismo"/>
-          <w:lang w:val="es-419" w:eastAsia="es-CO"/>
-        </w:rPr>
-        <w:t>insights</w:t>
-      </w:r>
-      <w:proofErr w:type="spellEnd"/>
-      <w:r>
-        <w:rPr>
-          <w:lang w:val="es-419" w:eastAsia="es-CO"/>
-        </w:rPr>
-        <w:t xml:space="preserve"> implica analizar patrones en la información obtenida para transformar los datos en conocimiento accionable (Muñoz &amp; Elosegui, 2018). La clave está en analizarlos con profundidad, identificar tendencias y reconocer patrones que ayuden a comprender mejor el comportamiento de los usuarios, el mercado y las oportunidades de negocio. </w:t>
-      </w:r>
-    </w:p>
-    <w:p>
-      <w:pPr>
-        <w:rPr>
-          <w:lang w:val="es-419" w:eastAsia="es-CO"/>
-        </w:rPr>
-      </w:pPr>
-      <w:r>
-        <w:rPr>
-          <w:lang w:val="es-419" w:eastAsia="es-CO"/>
-        </w:rPr>
-        <w:t>Le invitamos a</w:t>
-      </w:r>
-      <w:r>
-        <w:rPr>
-          <w:lang w:val="es-419" w:eastAsia="es-CO"/>
-        </w:rPr>
-        <w:t xml:space="preserve"> </w:t>
-      </w:r>
-      <w:r>
-        <w:rPr>
-          <w:lang w:val="es-419" w:eastAsia="es-CO"/>
-        </w:rPr>
-        <w:t>explorar</w:t>
-      </w:r>
-      <w:r>
-        <w:rPr>
-          <w:lang w:val="es-419" w:eastAsia="es-CO"/>
-        </w:rPr>
-        <w:t xml:space="preserve"> el siguiente video por medio del cual podrá apreciar un poco más al detalle sobre los </w:t>
+        <w:t xml:space="preserve">  </w:t>
       </w:r>
       <w:hyperlink r:id="rId16" w:history="1">
-        <w:proofErr w:type="spellStart"/>
         <w:r>
           <w:rPr>
-            <w:rStyle w:val="Extranjerismo"/>
+            <w:rStyle w:val="Hipervnculo"/>
             <w:b/>
             <w:bCs/>
-            <w:u w:val="single"/>
             <w:lang w:val="es-419" w:eastAsia="es-CO"/>
           </w:rPr>
-          <w:t>insight</w:t>
+          <w:t>ENLACE</w:t>
         </w:r>
-        <w:proofErr w:type="spellEnd"/>
       </w:hyperlink>
-      <w:r>
-        <w:rPr>
-          <w:lang w:val="es-419" w:eastAsia="es-CO"/>
-        </w:rPr>
-        <w:t>.</w:t>
-      </w:r>
     </w:p>
     <w:p>
       <w:pPr>
@@ -6689,142 +6760,123 @@
       </w:pPr>
       <w:r>
         <w:rPr>
-          <w:lang w:val="es-419" w:eastAsia="es-CO"/>
-        </w:rPr>
-        <w:t xml:space="preserve">Descripción. Un </w:t>
-      </w:r>
-      <w:proofErr w:type="spellStart"/>
-      <w:r>
-        <w:rPr>
-          <w:rStyle w:val="Extranjerismo"/>
-          <w:lang w:val="es-419" w:eastAsia="es-CO"/>
-        </w:rPr>
-        <w:t>insight</w:t>
-      </w:r>
-      <w:proofErr w:type="spellEnd"/>
-      <w:r>
-        <w:rPr>
-          <w:lang w:val="es-419" w:eastAsia="es-CO"/>
-        </w:rPr>
-        <w:t xml:space="preserve"> es una clave, la esencia que nos permite encontrar la solución a un problema. Un camino, un dato que nos sugiere como resolver cualquier ecuación por compleja que sea. Explicación del significado de </w:t>
-      </w:r>
-      <w:proofErr w:type="spellStart"/>
-      <w:r>
-        <w:rPr>
-          <w:rStyle w:val="Extranjerismo"/>
-          <w:lang w:val="es-419" w:eastAsia="es-CO"/>
-        </w:rPr>
-        <w:t>insight</w:t>
-      </w:r>
-      <w:proofErr w:type="spellEnd"/>
-      <w:r>
-        <w:rPr>
-          <w:lang w:val="es-419" w:eastAsia="es-CO"/>
-        </w:rPr>
-        <w:t xml:space="preserve"> y cómo encontrarlos dada desde el canal d</w:t>
-      </w:r>
-      <w:r>
-        <w:rPr>
-          <w:lang w:val="es-419" w:eastAsia="es-CO"/>
-        </w:rPr>
-        <w:t xml:space="preserve">e </w:t>
-      </w:r>
-      <w:proofErr w:type="spellStart"/>
-      <w:r>
-        <w:rPr>
-          <w:lang w:val="es-419" w:eastAsia="es-CO"/>
-        </w:rPr>
-        <w:t>S</w:t>
-      </w:r>
-      <w:r>
-        <w:rPr>
-          <w:lang w:val="es-419" w:eastAsia="es-CO"/>
-        </w:rPr>
-        <w:t>ocialmood</w:t>
-      </w:r>
-      <w:proofErr w:type="spellEnd"/>
-      <w:r>
-        <w:rPr>
-          <w:lang w:val="es-419" w:eastAsia="es-CO"/>
-        </w:rPr>
-        <w:t>, especializado en temas de social media y comunicación digital.</w:t>
-      </w:r>
-    </w:p>
-    <w:p>
-      <w:pPr>
-        <w:rPr>
-          <w:lang w:val="es-419" w:eastAsia="es-CO"/>
-        </w:rPr>
-      </w:pPr>
-      <w:r>
-        <w:rPr>
-          <w:lang w:val="es-419" w:eastAsia="es-CO"/>
-        </w:rPr>
-        <w:t xml:space="preserve">La generación de </w:t>
-      </w:r>
-      <w:proofErr w:type="spellStart"/>
-      <w:r>
-        <w:rPr>
-          <w:rStyle w:val="Extranjerismo"/>
-          <w:lang w:val="es-419" w:eastAsia="es-CO"/>
-        </w:rPr>
-        <w:t>insights</w:t>
-      </w:r>
-      <w:proofErr w:type="spellEnd"/>
-      <w:r>
-        <w:rPr>
-          <w:lang w:val="es-419" w:eastAsia="es-CO"/>
-        </w:rPr>
-        <w:t xml:space="preserve"> va más allá de los números, implica traducir la información en conocimiento útil que guíe decisiones estratégicas. Un buen </w:t>
-      </w:r>
-      <w:proofErr w:type="spellStart"/>
-      <w:r>
-        <w:rPr>
-          <w:rStyle w:val="Extranjerismo"/>
-          <w:lang w:val="es-419" w:eastAsia="es-CO"/>
-        </w:rPr>
-        <w:t>insight</w:t>
-      </w:r>
-      <w:proofErr w:type="spellEnd"/>
-      <w:r>
-        <w:rPr>
-          <w:lang w:val="es-419" w:eastAsia="es-CO"/>
-        </w:rPr>
-        <w:t xml:space="preserve"> permite anticiparse a cambios, detectar oportunidades y optimizar estrategias con base </w:t>
-      </w:r>
-      <w:r>
-        <w:rPr>
-          <w:lang w:val="es-419" w:eastAsia="es-CO"/>
-        </w:rPr>
-        <w:lastRenderedPageBreak/>
-        <w:t>en evidencia. En un entorno donde los datos están en constante crecimiento, la capacidad de interpretarlos correctamente es lo que marca la diferencia entre una decisión bien fundamentada y una apuesta a ciegas. La interpretación de datos en redes sociales requiere un proceso estructurado que permita transformar métricas en decisiones estratégicas. A continuación, se presentan los pasos clave para analizar la información y optimizar las acciones digitales:</w:t>
-      </w:r>
-    </w:p>
-    <w:p>
-      <w:pPr>
-        <w:rPr>
-          <w:lang w:val="es-419" w:eastAsia="es-CO"/>
-        </w:rPr>
-      </w:pPr>
-      <w:r>
-        <w:rPr>
           <w:b/>
           <w:bCs/>
           <w:lang w:val="es-419" w:eastAsia="es-CO"/>
         </w:rPr>
-        <w:t>Recopilación</w:t>
-      </w:r>
-      <w:r>
-        <w:rPr>
-          <w:lang w:val="es-419" w:eastAsia="es-CO"/>
-        </w:rPr>
-        <w:t>: o</w:t>
-      </w:r>
-      <w:r>
-        <w:rPr>
-          <w:lang w:val="es-419" w:eastAsia="es-CO"/>
-        </w:rPr>
-        <w:t>btención de métricas a través de herramientas de analítica web.</w:t>
+        <w:t>Descripción</w:t>
+      </w:r>
+      <w:r>
+        <w:rPr>
+          <w:lang w:val="es-419" w:eastAsia="es-CO"/>
+        </w:rPr>
+        <w:t xml:space="preserve">. Un </w:t>
+      </w:r>
+      <w:proofErr w:type="spellStart"/>
+      <w:r>
+        <w:rPr>
+          <w:rStyle w:val="Extranjerismo"/>
+          <w:lang w:val="es-419" w:eastAsia="es-CO"/>
+        </w:rPr>
+        <w:t>insight</w:t>
+      </w:r>
+      <w:proofErr w:type="spellEnd"/>
+      <w:r>
+        <w:rPr>
+          <w:lang w:val="es-419" w:eastAsia="es-CO"/>
+        </w:rPr>
+        <w:t xml:space="preserve"> es una clave, la esencia que nos permite encontrar la solución a un problema. Un camino, un dato que nos sugiere como resolver cualquier ecuación por compleja que sea. Explicación del significado de </w:t>
+      </w:r>
+      <w:proofErr w:type="spellStart"/>
+      <w:r>
+        <w:rPr>
+          <w:rStyle w:val="Extranjerismo"/>
+          <w:lang w:val="es-419" w:eastAsia="es-CO"/>
+        </w:rPr>
+        <w:t>insight</w:t>
+      </w:r>
+      <w:proofErr w:type="spellEnd"/>
+      <w:r>
+        <w:rPr>
+          <w:lang w:val="es-419" w:eastAsia="es-CO"/>
+        </w:rPr>
+        <w:t xml:space="preserve"> y cómo encontrarlos dada desde el canal d</w:t>
+      </w:r>
+      <w:r>
+        <w:rPr>
+          <w:lang w:val="es-419" w:eastAsia="es-CO"/>
+        </w:rPr>
+        <w:t xml:space="preserve">e </w:t>
+      </w:r>
+      <w:proofErr w:type="spellStart"/>
+      <w:r>
+        <w:rPr>
+          <w:lang w:val="es-419" w:eastAsia="es-CO"/>
+        </w:rPr>
+        <w:t>S</w:t>
+      </w:r>
+      <w:r>
+        <w:rPr>
+          <w:lang w:val="es-419" w:eastAsia="es-CO"/>
+        </w:rPr>
+        <w:t>ocialmood</w:t>
+      </w:r>
+      <w:proofErr w:type="spellEnd"/>
+      <w:r>
+        <w:rPr>
+          <w:lang w:val="es-419" w:eastAsia="es-CO"/>
+        </w:rPr>
+        <w:t>, especializado en temas de social media y comunicación digital.</w:t>
+      </w:r>
+    </w:p>
+    <w:p>
+      <w:pPr>
+        <w:rPr>
+          <w:lang w:val="es-419" w:eastAsia="es-CO"/>
+        </w:rPr>
+      </w:pPr>
+      <w:r>
+        <w:rPr>
+          <w:lang w:val="es-419" w:eastAsia="es-CO"/>
+        </w:rPr>
+        <w:t xml:space="preserve">La generación de </w:t>
+      </w:r>
+      <w:proofErr w:type="spellStart"/>
+      <w:r>
+        <w:rPr>
+          <w:rStyle w:val="Extranjerismo"/>
+          <w:lang w:val="es-419" w:eastAsia="es-CO"/>
+        </w:rPr>
+        <w:t>insights</w:t>
+      </w:r>
+      <w:proofErr w:type="spellEnd"/>
+      <w:r>
+        <w:rPr>
+          <w:lang w:val="es-419" w:eastAsia="es-CO"/>
+        </w:rPr>
+        <w:t xml:space="preserve"> va más allá de los números, implica traducir la información en conocimiento útil que guíe decisiones estratégicas. Un buen </w:t>
+      </w:r>
+      <w:proofErr w:type="spellStart"/>
+      <w:r>
+        <w:rPr>
+          <w:rStyle w:val="Extranjerismo"/>
+          <w:lang w:val="es-419" w:eastAsia="es-CO"/>
+        </w:rPr>
+        <w:t>insight</w:t>
+      </w:r>
+      <w:proofErr w:type="spellEnd"/>
+      <w:r>
+        <w:rPr>
+          <w:lang w:val="es-419" w:eastAsia="es-CO"/>
+        </w:rPr>
+        <w:t xml:space="preserve"> permite anticiparse a cambios, detectar oportunidades y optimizar estrategias con base en evidencia. En un entorno donde los datos están en constante crecimiento, la capacidad de interpretarlos correctamente es lo que marca la diferencia entre una </w:t>
+      </w:r>
+      <w:r>
+        <w:rPr>
+          <w:lang w:val="es-419" w:eastAsia="es-CO"/>
+        </w:rPr>
+        <w:lastRenderedPageBreak/>
+        <w:t>decisión bien fundamentada y una apuesta a ciegas. La interpretación de datos en redes sociales requiere un proceso estructurado que permita transformar métricas en decisiones estratégicas. A continuación, se presentan los pasos clave para analizar la información y optimizar las acciones digitales:</w:t>
       </w:r>
     </w:p>
     <w:p>
@@ -6839,19 +6891,19 @@
           <w:bCs/>
           <w:lang w:val="es-419" w:eastAsia="es-CO"/>
         </w:rPr>
-        <w:t>Organización</w:t>
-      </w:r>
-      <w:r>
-        <w:rPr>
-          <w:lang w:val="es-419" w:eastAsia="es-CO"/>
-        </w:rPr>
-        <w:t>: s</w:t>
-      </w:r>
-      <w:r>
-        <w:rPr>
-          <w:lang w:val="es-419" w:eastAsia="es-CO"/>
-        </w:rPr>
-        <w:t>egmentación de datos según objetivos de la empresa.</w:t>
+        <w:t>Recopilación</w:t>
+      </w:r>
+      <w:r>
+        <w:rPr>
+          <w:lang w:val="es-419" w:eastAsia="es-CO"/>
+        </w:rPr>
+        <w:t>: o</w:t>
+      </w:r>
+      <w:r>
+        <w:rPr>
+          <w:lang w:val="es-419" w:eastAsia="es-CO"/>
+        </w:rPr>
+        <w:t>btención de métricas a través de herramientas de analítica web.</w:t>
       </w:r>
     </w:p>
     <w:p>
@@ -6866,19 +6918,19 @@
           <w:bCs/>
           <w:lang w:val="es-419" w:eastAsia="es-CO"/>
         </w:rPr>
-        <w:t>Comparación</w:t>
-      </w:r>
-      <w:r>
-        <w:rPr>
-          <w:lang w:val="es-419" w:eastAsia="es-CO"/>
-        </w:rPr>
-        <w:t>: e</w:t>
-      </w:r>
-      <w:r>
-        <w:rPr>
-          <w:lang w:val="es-419" w:eastAsia="es-CO"/>
-        </w:rPr>
-        <w:t>valuación de tendencias en distintos períodos de tiempo.</w:t>
+        <w:t>Organización</w:t>
+      </w:r>
+      <w:r>
+        <w:rPr>
+          <w:lang w:val="es-419" w:eastAsia="es-CO"/>
+        </w:rPr>
+        <w:t>: s</w:t>
+      </w:r>
+      <w:r>
+        <w:rPr>
+          <w:lang w:val="es-419" w:eastAsia="es-CO"/>
+        </w:rPr>
+        <w:t>egmentación de datos según objetivos de la empresa.</w:t>
       </w:r>
     </w:p>
     <w:p>
@@ -6893,19 +6945,19 @@
           <w:bCs/>
           <w:lang w:val="es-419" w:eastAsia="es-CO"/>
         </w:rPr>
-        <w:t>Identificación de patrones</w:t>
-      </w:r>
-      <w:r>
-        <w:rPr>
-          <w:lang w:val="es-419" w:eastAsia="es-CO"/>
-        </w:rPr>
-        <w:t>: d</w:t>
-      </w:r>
-      <w:r>
-        <w:rPr>
-          <w:lang w:val="es-419" w:eastAsia="es-CO"/>
-        </w:rPr>
-        <w:t>etección de cambios en el comportamiento de la audiencia.</w:t>
+        <w:t>Comparación</w:t>
+      </w:r>
+      <w:r>
+        <w:rPr>
+          <w:lang w:val="es-419" w:eastAsia="es-CO"/>
+        </w:rPr>
+        <w:t>: e</w:t>
+      </w:r>
+      <w:r>
+        <w:rPr>
+          <w:lang w:val="es-419" w:eastAsia="es-CO"/>
+        </w:rPr>
+        <w:t>valuación de tendencias en distintos períodos de tiempo.</w:t>
       </w:r>
     </w:p>
     <w:p>
@@ -6920,6 +6972,33 @@
           <w:bCs/>
           <w:lang w:val="es-419" w:eastAsia="es-CO"/>
         </w:rPr>
+        <w:t>Identificación de patrones</w:t>
+      </w:r>
+      <w:r>
+        <w:rPr>
+          <w:lang w:val="es-419" w:eastAsia="es-CO"/>
+        </w:rPr>
+        <w:t>: d</w:t>
+      </w:r>
+      <w:r>
+        <w:rPr>
+          <w:lang w:val="es-419" w:eastAsia="es-CO"/>
+        </w:rPr>
+        <w:t>etección de cambios en el comportamiento de la audiencia.</w:t>
+      </w:r>
+    </w:p>
+    <w:p>
+      <w:pPr>
+        <w:rPr>
+          <w:lang w:val="es-419" w:eastAsia="es-CO"/>
+        </w:rPr>
+      </w:pPr>
+      <w:r>
+        <w:rPr>
+          <w:b/>
+          <w:bCs/>
+          <w:lang w:val="es-419" w:eastAsia="es-CO"/>
+        </w:rPr>
         <w:t>Acción</w:t>
       </w:r>
       <w:r>
@@ -6954,7 +7033,7 @@
       <w:pPr>
         <w:pStyle w:val="Ttulo2"/>
       </w:pPr>
-      <w:bookmarkStart w:id="9" w:name="_Toc207623126"/>
+      <w:bookmarkStart w:id="9" w:name="_Toc208996124"/>
       <w:r>
         <w:t>Indicadores</w:t>
       </w:r>
@@ -7066,50 +7145,49 @@
           <w:lang w:val="es-419" w:eastAsia="es-CO"/>
         </w:rPr>
       </w:pPr>
-    </w:p>
-    <w:p>
-      <w:pPr>
-        <w:rPr>
-          <w:lang w:val="es-419" w:eastAsia="es-CO"/>
-        </w:rPr>
-      </w:pPr>
+      <w:r>
+        <w:rPr>
+          <w:lang w:val="es-419" w:eastAsia="es-CO"/>
+        </w:rPr>
+        <w:t xml:space="preserve">Las </w:t>
+      </w:r>
+      <w:proofErr w:type="spellStart"/>
+      <w:r>
+        <w:rPr>
+          <w:rStyle w:val="Extranjerismo"/>
+          <w:lang w:val="es-419" w:eastAsia="es-CO"/>
+        </w:rPr>
+        <w:t>vanity</w:t>
+      </w:r>
+      <w:proofErr w:type="spellEnd"/>
+      <w:r>
+        <w:rPr>
+          <w:rStyle w:val="Extranjerismo"/>
+          <w:lang w:val="es-419" w:eastAsia="es-CO"/>
+        </w:rPr>
+        <w:t xml:space="preserve"> </w:t>
+      </w:r>
+      <w:proofErr w:type="spellStart"/>
+      <w:r>
+        <w:rPr>
+          <w:rStyle w:val="Extranjerismo"/>
+          <w:lang w:val="es-419" w:eastAsia="es-CO"/>
+        </w:rPr>
+        <w:t>metrics</w:t>
+      </w:r>
+      <w:proofErr w:type="spellEnd"/>
+      <w:r>
+        <w:rPr>
+          <w:lang w:val="es-419" w:eastAsia="es-CO"/>
+        </w:rPr>
+        <w:t xml:space="preserve">, como la cantidad de seguidores en redes sociales o las visualizaciones de una página web, pueden parecer impresionantes a primera vista, pero no siempre reflejan un impacto real en el crecimiento o la toma de decisiones. En </w:t>
+      </w:r>
       <w:r>
         <w:rPr>
           <w:lang w:val="es-419" w:eastAsia="es-CO"/>
         </w:rPr>
         <w:lastRenderedPageBreak/>
-        <w:t xml:space="preserve">Las </w:t>
-      </w:r>
-      <w:proofErr w:type="spellStart"/>
-      <w:r>
-        <w:rPr>
-          <w:rStyle w:val="Extranjerismo"/>
-          <w:lang w:val="es-419" w:eastAsia="es-CO"/>
-        </w:rPr>
-        <w:t>vanity</w:t>
-      </w:r>
-      <w:proofErr w:type="spellEnd"/>
-      <w:r>
-        <w:rPr>
-          <w:rStyle w:val="Extranjerismo"/>
-          <w:lang w:val="es-419" w:eastAsia="es-CO"/>
-        </w:rPr>
-        <w:t xml:space="preserve"> </w:t>
-      </w:r>
-      <w:proofErr w:type="spellStart"/>
-      <w:r>
-        <w:rPr>
-          <w:rStyle w:val="Extranjerismo"/>
-          <w:lang w:val="es-419" w:eastAsia="es-CO"/>
-        </w:rPr>
-        <w:t>metrics</w:t>
-      </w:r>
-      <w:proofErr w:type="spellEnd"/>
-      <w:r>
-        <w:rPr>
-          <w:lang w:val="es-419" w:eastAsia="es-CO"/>
-        </w:rPr>
-        <w:t>, como la cantidad de seguidores en redes sociales o las visualizaciones de una página web, pueden parecer impresionantes a primera vista, pero no siempre reflejan un impacto real en el crecimiento o la toma de decisiones. En contraste, las métricas accionables proporcionan información clave para ajustar estrategias, optimizar procesos y mejorar el rendimiento general del negocio. Estas métricas, bien interpretadas y utilizadas, permiten tomar decisiones fundamentadas que contribuyen al cumplimiento de objetivos específicos, impulsando el éxito y la competitividad en el mercado:</w:t>
+        <w:t>contraste, las métricas accionables proporcionan información clave para ajustar estrategias, optimizar procesos y mejorar el rendimiento general del negocio. Estas métricas, bien interpretadas y utilizadas, permiten tomar decisiones fundamentadas que contribuyen al cumplimiento de objetivos específicos, impulsando el éxito y la competitividad en el mercado:</w:t>
       </w:r>
     </w:p>
     <w:p>
@@ -7187,13 +7265,7 @@
         <w:rPr>
           <w:lang w:val="es-419" w:eastAsia="es-CO"/>
         </w:rPr>
-        <w:t xml:space="preserve">: </w:t>
-      </w:r>
-      <w:r>
-        <w:rPr>
-          <w:lang w:val="es-419" w:eastAsia="es-CO"/>
-        </w:rPr>
-        <w:t>u</w:t>
+        <w:t>. U</w:t>
       </w:r>
       <w:r>
         <w:rPr>
@@ -7238,30 +7310,24 @@
     </w:p>
     <w:p>
       <w:pPr>
-        <w:rPr>
-          <w:lang w:val="es-419" w:eastAsia="es-CO"/>
-        </w:rPr>
-      </w:pPr>
-    </w:p>
-    <w:p>
-      <w:pPr>
-        <w:rPr>
-          <w:lang w:val="es-419" w:eastAsia="es-CO"/>
-        </w:rPr>
-      </w:pPr>
-    </w:p>
-    <w:p>
-      <w:pPr>
-        <w:rPr>
-          <w:lang w:val="es-419" w:eastAsia="es-CO"/>
-        </w:rPr>
-      </w:pPr>
+        <w:spacing w:before="0" w:after="160" w:line="259" w:lineRule="auto"/>
+        <w:ind w:firstLine="0"/>
+        <w:rPr>
+          <w:lang w:val="es-419" w:eastAsia="es-CO"/>
+        </w:rPr>
+      </w:pPr>
+      <w:r>
+        <w:rPr>
+          <w:lang w:val="es-419" w:eastAsia="es-CO"/>
+        </w:rPr>
+        <w:br w:type="page"/>
+      </w:r>
     </w:p>
     <w:p>
       <w:pPr>
         <w:pStyle w:val="Ttulo1"/>
       </w:pPr>
-      <w:bookmarkStart w:id="10" w:name="_Toc207623127"/>
+      <w:bookmarkStart w:id="10" w:name="_Toc208996125"/>
       <w:r>
         <w:lastRenderedPageBreak/>
         <w:t>Herramientas de análisis</w:t>
@@ -7551,7 +7617,7 @@
       <w:pPr>
         <w:pStyle w:val="Ttulo2"/>
       </w:pPr>
-      <w:bookmarkStart w:id="11" w:name="_Toc207623128"/>
+      <w:bookmarkStart w:id="11" w:name="_Toc208996126"/>
       <w:r>
         <w:t>Ejemplos</w:t>
       </w:r>
@@ -8439,9 +8505,8 @@
                 <w:rStyle w:val="Extranjerismo"/>
                 <w:sz w:val="28"/>
                 <w:szCs w:val="28"/>
-                <w:lang w:val="es-CO"/>
-              </w:rPr>
-              <w:t>marketing</w:t>
+              </w:rPr>
+              <w:t>marketing digital</w:t>
             </w:r>
             <w:r>
               <w:rPr>
@@ -8450,7 +8515,7 @@
                 <w:szCs w:val="28"/>
                 <w:lang w:val="es-CO"/>
               </w:rPr>
-              <w:t xml:space="preserve"> digital.</w:t>
+              <w:t>.</w:t>
             </w:r>
           </w:p>
         </w:tc>
@@ -8476,7 +8541,25 @@
                 <w:szCs w:val="28"/>
                 <w:lang w:val="es-CO"/>
               </w:rPr>
-              <w:t>Semrush</w:t>
+              <w:t>S</w:t>
+            </w:r>
+            <w:r>
+              <w:rPr>
+                <w:rFonts w:asciiTheme="minorHAnsi" w:hAnsiTheme="minorHAnsi" w:cs="Arial"/>
+                <w:sz w:val="28"/>
+                <w:szCs w:val="28"/>
+                <w:lang w:val="es-CO"/>
+              </w:rPr>
+              <w:t>EM</w:t>
+            </w:r>
+            <w:r>
+              <w:rPr>
+                <w:rFonts w:asciiTheme="minorHAnsi" w:hAnsiTheme="minorHAnsi" w:cs="Arial"/>
+                <w:sz w:val="28"/>
+                <w:szCs w:val="28"/>
+                <w:lang w:val="es-CO"/>
+              </w:rPr>
+              <w:t>rush</w:t>
             </w:r>
             <w:proofErr w:type="spellEnd"/>
             <w:r>
@@ -8670,7 +8753,7 @@
       <w:pPr>
         <w:pStyle w:val="Ttulo2"/>
       </w:pPr>
-      <w:bookmarkStart w:id="12" w:name="_Toc207623129"/>
+      <w:bookmarkStart w:id="12" w:name="_Toc208996127"/>
       <w:r>
         <w:t>Informes</w:t>
       </w:r>
@@ -8949,7 +9032,7 @@
       <w:pPr>
         <w:pStyle w:val="Ttulo1"/>
       </w:pPr>
-      <w:bookmarkStart w:id="13" w:name="_Toc207623130"/>
+      <w:bookmarkStart w:id="13" w:name="_Toc208996128"/>
       <w:r>
         <w:lastRenderedPageBreak/>
         <w:t>Acciones de mejora</w:t>
@@ -9061,7 +9144,7 @@
       <w:pPr>
         <w:pStyle w:val="Ttulo2"/>
       </w:pPr>
-      <w:bookmarkStart w:id="14" w:name="_Toc207623131"/>
+      <w:bookmarkStart w:id="14" w:name="_Toc208996129"/>
       <w:r>
         <w:t>Aplicabilidad</w:t>
       </w:r>
@@ -9244,7 +9327,7 @@
       <w:pPr>
         <w:pStyle w:val="Ttulo2"/>
       </w:pPr>
-      <w:bookmarkStart w:id="15" w:name="_Toc207623132"/>
+      <w:bookmarkStart w:id="15" w:name="_Toc208996130"/>
       <w:r>
         <w:t>Efectividad de cambios</w:t>
       </w:r>
@@ -9423,7 +9506,7 @@
       <w:pPr>
         <w:pStyle w:val="Titulosgenerales"/>
       </w:pPr>
-      <w:bookmarkStart w:id="16" w:name="_Toc207623133"/>
+      <w:bookmarkStart w:id="16" w:name="_Toc208996131"/>
       <w:r>
         <w:lastRenderedPageBreak/>
         <w:t>Síntesis</w:t>
@@ -9500,10 +9583,10 @@
           <w:lang w:val="es-419" w:eastAsia="es-CO"/>
         </w:rPr>
         <w:drawing>
-          <wp:inline distT="0" distB="0" distL="0" distR="0" wp14:anchorId="11013F90" wp14:editId="03822598">
+          <wp:inline distT="0" distB="0" distL="0" distR="0" wp14:anchorId="11013F90" wp14:editId="178A8EA2">
             <wp:extent cx="6241312" cy="3352234"/>
             <wp:effectExtent l="0" t="0" r="7620" b="635"/>
-            <wp:docPr id="1" name="Gráfico 1" descr="El componente formativo “Optimización digital mediante analítica web, ofrece una visión general del uso estratégico de datos en entornos digitales. Se abordan temas como analítica web, tipos e importancia de las métricas, análisis en redes sociales, aplicación de estándares e indicadores, herramientas para el análisis y generación de informes, finalizando con acciones de mejora orientadas a evaluar la efectividad de los cambios implementados."/>
+            <wp:docPr id="1" name="Gráfico 1" descr="El componente formativo “Optimización digital mediante analítica web&quot;, ofrece una visión general del uso estratégico de datos en entornos digitales. Se abordan temas como analítica web, tipos e importancia de las métricas, análisis en redes sociales, aplicación de estándares e indicadores, herramientas para el análisis y generación de informes, finalizando con acciones de mejora orientadas a evaluar la efectividad de los cambios implementados."/>
             <wp:cNvGraphicFramePr>
               <a:graphicFrameLocks xmlns:a="http://schemas.openxmlformats.org/drawingml/2006/main" noChangeAspect="1"/>
             </wp:cNvGraphicFramePr>
@@ -9511,7 +9594,7 @@
               <a:graphicData uri="http://schemas.openxmlformats.org/drawingml/2006/picture">
                 <pic:pic xmlns:pic="http://schemas.openxmlformats.org/drawingml/2006/picture">
                   <pic:nvPicPr>
-                    <pic:cNvPr id="1" name="Gráfico 1" descr="El componente formativo “Optimización digital mediante analítica web, ofrece una visión general del uso estratégico de datos en entornos digitales. Se abordan temas como analítica web, tipos e importancia de las métricas, análisis en redes sociales, aplicación de estándares e indicadores, herramientas para el análisis y generación de informes, finalizando con acciones de mejora orientadas a evaluar la efectividad de los cambios implementados."/>
+                    <pic:cNvPr id="1" name="Gráfico 1" descr="El componente formativo “Optimización digital mediante analítica web&quot;, ofrece una visión general del uso estratégico de datos en entornos digitales. Se abordan temas como analítica web, tipos e importancia de las métricas, análisis en redes sociales, aplicación de estándares e indicadores, herramientas para el análisis y generación de informes, finalizando con acciones de mejora orientadas a evaluar la efectividad de los cambios implementados."/>
                     <pic:cNvPicPr/>
                   </pic:nvPicPr>
                   <pic:blipFill>
@@ -9556,7 +9639,7 @@
       <w:pPr>
         <w:pStyle w:val="Titulosgenerales"/>
       </w:pPr>
-      <w:bookmarkStart w:id="17" w:name="_Toc207623134"/>
+      <w:bookmarkStart w:id="17" w:name="_Toc208996132"/>
       <w:r>
         <w:lastRenderedPageBreak/>
         <w:t>Glosario</w:t>
@@ -10585,7 +10668,7 @@
       <w:pPr>
         <w:pStyle w:val="Titulosgenerales"/>
       </w:pPr>
-      <w:bookmarkStart w:id="18" w:name="_Toc207623135"/>
+      <w:bookmarkStart w:id="18" w:name="_Toc208996133"/>
       <w:r>
         <w:lastRenderedPageBreak/>
         <w:t>Material complementario</w:t>
@@ -11131,7 +11214,7 @@
       <w:pPr>
         <w:pStyle w:val="Titulosgenerales"/>
       </w:pPr>
-      <w:bookmarkStart w:id="19" w:name="_Toc207623136"/>
+      <w:bookmarkStart w:id="19" w:name="_Toc208996134"/>
       <w:r>
         <w:lastRenderedPageBreak/>
         <w:t>Referencias bibliográficas</w:t>
@@ -11866,7 +11949,7 @@
       <w:pPr>
         <w:pStyle w:val="Titulosgenerales"/>
       </w:pPr>
-      <w:bookmarkStart w:id="22" w:name="_Toc207623137"/>
+      <w:bookmarkStart w:id="22" w:name="_Toc208996135"/>
       <w:r>
         <w:lastRenderedPageBreak/>
         <w:t>C</w:t>
@@ -16873,26 +16956,6 @@
 </file>
 
 <file path=customXml/item1.xml><?xml version="1.0" encoding="utf-8"?>
-<p:properties xmlns:p="http://schemas.microsoft.com/office/2006/metadata/properties" xmlns:xsi="http://www.w3.org/2001/XMLSchema-instance" xmlns:pc="http://schemas.microsoft.com/office/infopath/2007/PartnerControls">
-  <documentManagement>
-    <TaxCatchAll xmlns="cb45339b-ced9-4d0d-8f64-77573914d53b"/>
-    <lcf76f155ced4ddcb4097134ff3c332f xmlns="43a3ca16-9c26-4813-b83f-4aec9927b43f">
-      <Terms xmlns="http://schemas.microsoft.com/office/infopath/2007/PartnerControls"/>
-    </lcf76f155ced4ddcb4097134ff3c332f>
-  </documentManagement>
-</p:properties>
-</file>
-
-<file path=customXml/item2.xml><?xml version="1.0" encoding="utf-8"?>
-<?mso-contentType ?>
-<FormTemplates xmlns="http://schemas.microsoft.com/sharepoint/v3/contenttype/forms">
-  <Display>DocumentLibraryForm</Display>
-  <Edit>DocumentLibraryForm</Edit>
-  <New>DocumentLibraryForm</New>
-</FormTemplates>
-</file>
-
-<file path=customXml/item3.xml><?xml version="1.0" encoding="utf-8"?>
 <ct:contentTypeSchema xmlns:ct="http://schemas.microsoft.com/office/2006/metadata/contentType" xmlns:ma="http://schemas.microsoft.com/office/2006/metadata/properties/metaAttributes" ct:_="" ma:_="" ma:contentTypeName="Documento" ma:contentTypeID="0x01010049282E1EDBE9234EA9E6D38F720E265F" ma:contentTypeVersion="15" ma:contentTypeDescription="Crear nuevo documento." ma:contentTypeScope="" ma:versionID="b31c7aa9eaf043a08b87120b3c4916e3">
   <xsd:schema xmlns:xsd="http://www.w3.org/2001/XMLSchema" xmlns:xs="http://www.w3.org/2001/XMLSchema" xmlns:p="http://schemas.microsoft.com/office/2006/metadata/properties" xmlns:ns2="cb45339b-ced9-4d0d-8f64-77573914d53b" xmlns:ns3="43a3ca16-9c26-4813-b83f-4aec9927b43f" targetNamespace="http://schemas.microsoft.com/office/2006/metadata/properties" ma:root="true" ma:fieldsID="3533d065b04d75c457075bc55f1f5315" ns2:_="" ns3:_="">
     <xsd:import namespace="cb45339b-ced9-4d0d-8f64-77573914d53b"/>
@@ -17127,30 +17190,31 @@
 </ct:contentTypeSchema>
 </file>
 
+<file path=customXml/item2.xml><?xml version="1.0" encoding="utf-8"?>
+<?mso-contentType ?>
+<FormTemplates xmlns="http://schemas.microsoft.com/sharepoint/v3/contenttype/forms">
+  <Display>DocumentLibraryForm</Display>
+  <Edit>DocumentLibraryForm</Edit>
+  <New>DocumentLibraryForm</New>
+</FormTemplates>
+</file>
+
+<file path=customXml/item3.xml><?xml version="1.0" encoding="utf-8"?>
+<p:properties xmlns:p="http://schemas.microsoft.com/office/2006/metadata/properties" xmlns:xsi="http://www.w3.org/2001/XMLSchema-instance" xmlns:pc="http://schemas.microsoft.com/office/infopath/2007/PartnerControls">
+  <documentManagement>
+    <TaxCatchAll xmlns="cb45339b-ced9-4d0d-8f64-77573914d53b"/>
+    <lcf76f155ced4ddcb4097134ff3c332f xmlns="43a3ca16-9c26-4813-b83f-4aec9927b43f">
+      <Terms xmlns="http://schemas.microsoft.com/office/infopath/2007/PartnerControls"/>
+    </lcf76f155ced4ddcb4097134ff3c332f>
+  </documentManagement>
+</p:properties>
+</file>
+
 <file path=customXml/item4.xml><?xml version="1.0" encoding="utf-8"?>
 <b:Sources xmlns:b="http://schemas.openxmlformats.org/officeDocument/2006/bibliography" xmlns="http://schemas.openxmlformats.org/officeDocument/2006/bibliography" SelectedStyle="\APASixthEditionOfficeOnline.xsl" StyleName="APA" Version="6"/>
 </file>
 
 <file path=customXml/itemProps1.xml><?xml version="1.0" encoding="utf-8"?>
-<ds:datastoreItem xmlns:ds="http://schemas.openxmlformats.org/officeDocument/2006/customXml" ds:itemID="{1145D752-ACC1-45E1-AB53-0C756F67FC7F}">
-  <ds:schemaRefs>
-    <ds:schemaRef ds:uri="http://schemas.microsoft.com/office/2006/metadata/properties"/>
-    <ds:schemaRef ds:uri="http://schemas.microsoft.com/office/infopath/2007/PartnerControls"/>
-    <ds:schemaRef ds:uri="cb45339b-ced9-4d0d-8f64-77573914d53b"/>
-    <ds:schemaRef ds:uri="43a3ca16-9c26-4813-b83f-4aec9927b43f"/>
-  </ds:schemaRefs>
-</ds:datastoreItem>
-</file>
-
-<file path=customXml/itemProps2.xml><?xml version="1.0" encoding="utf-8"?>
-<ds:datastoreItem xmlns:ds="http://schemas.openxmlformats.org/officeDocument/2006/customXml" ds:itemID="{81CBDEC1-3B00-44ED-AD36-0268077980BA}">
-  <ds:schemaRefs>
-    <ds:schemaRef ds:uri="http://schemas.microsoft.com/sharepoint/v3/contenttype/forms"/>
-  </ds:schemaRefs>
-</ds:datastoreItem>
-</file>
-
-<file path=customXml/itemProps3.xml><?xml version="1.0" encoding="utf-8"?>
 <ds:datastoreItem xmlns:ds="http://schemas.openxmlformats.org/officeDocument/2006/customXml" ds:itemID="{DF43E046-DB0C-42D1-8C73-AE38B52F1ED7}">
   <ds:schemaRefs>
     <ds:schemaRef ds:uri="http://schemas.microsoft.com/office/2006/metadata/contentType"/>
@@ -17169,6 +17233,25 @@
 </ds:datastoreItem>
 </file>
 
+<file path=customXml/itemProps2.xml><?xml version="1.0" encoding="utf-8"?>
+<ds:datastoreItem xmlns:ds="http://schemas.openxmlformats.org/officeDocument/2006/customXml" ds:itemID="{81CBDEC1-3B00-44ED-AD36-0268077980BA}">
+  <ds:schemaRefs>
+    <ds:schemaRef ds:uri="http://schemas.microsoft.com/sharepoint/v3/contenttype/forms"/>
+  </ds:schemaRefs>
+</ds:datastoreItem>
+</file>
+
+<file path=customXml/itemProps3.xml><?xml version="1.0" encoding="utf-8"?>
+<ds:datastoreItem xmlns:ds="http://schemas.openxmlformats.org/officeDocument/2006/customXml" ds:itemID="{1145D752-ACC1-45E1-AB53-0C756F67FC7F}">
+  <ds:schemaRefs>
+    <ds:schemaRef ds:uri="http://schemas.microsoft.com/office/2006/metadata/properties"/>
+    <ds:schemaRef ds:uri="http://schemas.microsoft.com/office/infopath/2007/PartnerControls"/>
+    <ds:schemaRef ds:uri="cb45339b-ced9-4d0d-8f64-77573914d53b"/>
+    <ds:schemaRef ds:uri="43a3ca16-9c26-4813-b83f-4aec9927b43f"/>
+  </ds:schemaRefs>
+</ds:datastoreItem>
+</file>
+
 <file path=customXml/itemProps4.xml><?xml version="1.0" encoding="utf-8"?>
 <ds:datastoreItem xmlns:ds="http://schemas.openxmlformats.org/officeDocument/2006/customXml" ds:itemID="{E8AB44A3-7C62-4BD2-82ED-8ABC209970FA}">
   <ds:schemaRefs>

</xml_diff>

<commit_message>
Ajuste en texto de figura 1
</commit_message>
<xml_diff>
--- a/fuentes/CFA2_63220007_DU.docx
+++ b/fuentes/CFA2_63220007_DU.docx
@@ -85,7 +85,7 @@
               </wp:anchor>
             </w:drawing>
           </mc:Choice>
-          <mc:Fallback xmlns:oel="http://schemas.microsoft.com/office/2019/extlst" xmlns:w16du="http://schemas.microsoft.com/office/word/2023/wordml/word16du" xmlns:w16sdtfl="http://schemas.microsoft.com/office/word/2024/wordml/sdtformatlock">
+          <mc:Fallback xmlns:w16sdtfl="http://schemas.microsoft.com/office/word/2024/wordml/sdtformatlock" xmlns:w16du="http://schemas.microsoft.com/office/word/2023/wordml/word16du" xmlns:oel="http://schemas.microsoft.com/office/2019/extlst">
             <w:pict>
               <v:rect w14:anchorId="4E7873B1" id="Rectángulo 3" o:spid="_x0000_s1026" alt="&quot;&quot;" style="position:absolute;margin-left:-54pt;margin-top:31.65pt;width:613.85pt;height:204pt;z-index:-251655168;visibility:visible;mso-wrap-style:square;mso-height-percent:0;mso-wrap-distance-left:9pt;mso-wrap-distance-top:0;mso-wrap-distance-right:9pt;mso-wrap-distance-bottom:0;mso-position-horizontal:absolute;mso-position-horizontal-relative:text;mso-position-vertical:absolute;mso-position-vertical-relative:text;mso-height-percent:0;mso-height-relative:margin;v-text-anchor:middle" o:gfxdata="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" fillcolor="#00314d" stroked="f" strokeweight="1pt"/>
             </w:pict>
@@ -2992,6 +2992,120 @@
           <w:szCs w:val="28"/>
           <w:lang w:val="es-419"/>
         </w:rPr>
+        <w:t>Las características de la analítica web</w:t>
+      </w:r>
+      <w:r>
+        <w:rPr>
+          <w:rFonts w:ascii="Calibri" w:hAnsi="Calibri" w:cs="Calibri"/>
+          <w:szCs w:val="28"/>
+          <w:lang w:val="es-419"/>
+        </w:rPr>
+        <w:t>:</w:t>
+      </w:r>
+    </w:p>
+    <w:p>
+      <w:pPr>
+        <w:pStyle w:val="Prrafodelista"/>
+        <w:numPr>
+          <w:ilvl w:val="0"/>
+          <w:numId w:val="20"/>
+        </w:numPr>
+        <w:rPr>
+          <w:rFonts w:ascii="Calibri" w:hAnsi="Calibri" w:cs="Calibri"/>
+          <w:szCs w:val="28"/>
+          <w:lang w:val="es-419"/>
+        </w:rPr>
+      </w:pPr>
+      <w:r>
+        <w:rPr>
+          <w:rFonts w:ascii="Calibri" w:hAnsi="Calibri" w:cs="Calibri"/>
+          <w:szCs w:val="28"/>
+          <w:lang w:val="es-419"/>
+        </w:rPr>
+        <w:t>Permite identificar tendencias de comportamiento de los usuarios.</w:t>
+      </w:r>
+    </w:p>
+    <w:p>
+      <w:pPr>
+        <w:pStyle w:val="Prrafodelista"/>
+        <w:numPr>
+          <w:ilvl w:val="0"/>
+          <w:numId w:val="20"/>
+        </w:numPr>
+        <w:rPr>
+          <w:rFonts w:ascii="Calibri" w:hAnsi="Calibri" w:cs="Calibri"/>
+          <w:szCs w:val="28"/>
+          <w:lang w:val="es-419"/>
+        </w:rPr>
+      </w:pPr>
+      <w:r>
+        <w:rPr>
+          <w:rFonts w:ascii="Calibri" w:hAnsi="Calibri" w:cs="Calibri"/>
+          <w:szCs w:val="28"/>
+          <w:lang w:val="es-419"/>
+        </w:rPr>
+        <w:t>Facilita la medición de la efectividad de estrategias digitales.</w:t>
+      </w:r>
+    </w:p>
+    <w:p>
+      <w:pPr>
+        <w:pStyle w:val="Prrafodelista"/>
+        <w:numPr>
+          <w:ilvl w:val="0"/>
+          <w:numId w:val="20"/>
+        </w:numPr>
+        <w:rPr>
+          <w:rFonts w:ascii="Calibri" w:hAnsi="Calibri" w:cs="Calibri"/>
+          <w:szCs w:val="28"/>
+          <w:lang w:val="es-419"/>
+        </w:rPr>
+      </w:pPr>
+      <w:r>
+        <w:rPr>
+          <w:rFonts w:ascii="Calibri" w:hAnsi="Calibri" w:cs="Calibri"/>
+          <w:szCs w:val="28"/>
+          <w:lang w:val="es-419"/>
+        </w:rPr>
+        <w:t>Proporciona datos para la optimización de contenidos.</w:t>
+      </w:r>
+    </w:p>
+    <w:p>
+      <w:pPr>
+        <w:pStyle w:val="Prrafodelista"/>
+        <w:numPr>
+          <w:ilvl w:val="0"/>
+          <w:numId w:val="20"/>
+        </w:numPr>
+        <w:rPr>
+          <w:rFonts w:ascii="Calibri" w:hAnsi="Calibri" w:cs="Calibri"/>
+          <w:szCs w:val="28"/>
+          <w:lang w:val="es-419"/>
+        </w:rPr>
+      </w:pPr>
+      <w:r>
+        <w:rPr>
+          <w:rFonts w:ascii="Calibri" w:hAnsi="Calibri" w:cs="Calibri"/>
+          <w:szCs w:val="28"/>
+          <w:lang w:val="es-419"/>
+        </w:rPr>
+        <w:t>Ayuda a mejorar la experiencia del usuario en plataformas digitales.</w:t>
+      </w:r>
+    </w:p>
+    <w:p>
+      <w:pPr>
+        <w:rPr>
+          <w:rFonts w:ascii="Calibri" w:hAnsi="Calibri" w:cs="Calibri"/>
+          <w:szCs w:val="28"/>
+          <w:lang w:val="es-419"/>
+        </w:rPr>
+      </w:pPr>
+      <w:r>
+        <w:rPr>
+          <w:rFonts w:ascii="Calibri" w:hAnsi="Calibri" w:cs="Calibri"/>
+          <w:szCs w:val="28"/>
+          <w:lang w:val="es-419"/>
+        </w:rPr>
+        <w:lastRenderedPageBreak/>
         <w:t>Las redes sociales se han convertido en el principal canal de comunicación entre empresas y consumidores, analizar datos de estas plataformas permite tomar decisiones basadas en información real en lugar de suposiciones (Muñoz &amp; Elosegui, 2018).</w:t>
       </w:r>
     </w:p>
@@ -3009,7 +3123,6 @@
           <w:szCs w:val="28"/>
           <w:lang w:val="es-419"/>
         </w:rPr>
-        <w:lastRenderedPageBreak/>
         <w:t>Son múltiples los beneficios de la analítica web en redes sociales, algunos de ellos son la segmentación precisa, la cual permite conocer el perfil de la audiencia y adaptar estrategias, la optimización del contenido que ayuda a identificar qué tipo de publicaciones generan más interacción y la medición del retorno de inversión (ROI) que facilita la evaluación del impacto de campañas digitales.</w:t>
       </w:r>
     </w:p>
@@ -14066,9 +14179,9 @@
     </w:lvl>
   </w:abstractNum>
   <w:abstractNum w:abstractNumId="8" w15:restartNumberingAfterBreak="0">
-    <w:nsid w:val="419F3570"/>
+    <w:nsid w:val="3F8D3B98"/>
     <w:multiLevelType w:val="hybridMultilevel"/>
-    <w:tmpl w:val="90882F1C"/>
+    <w:tmpl w:val="F6BE9392"/>
     <w:lvl w:ilvl="0" w:tplc="240A0001">
       <w:start w:val="1"/>
       <w:numFmt w:val="bullet"/>
@@ -14179,9 +14292,9 @@
     </w:lvl>
   </w:abstractNum>
   <w:abstractNum w:abstractNumId="9" w15:restartNumberingAfterBreak="0">
-    <w:nsid w:val="4C5F0B7D"/>
+    <w:nsid w:val="419F3570"/>
     <w:multiLevelType w:val="hybridMultilevel"/>
-    <w:tmpl w:val="C9CE6292"/>
+    <w:tmpl w:val="90882F1C"/>
     <w:lvl w:ilvl="0" w:tplc="240A0001">
       <w:start w:val="1"/>
       <w:numFmt w:val="bullet"/>
@@ -14292,6 +14405,119 @@
     </w:lvl>
   </w:abstractNum>
   <w:abstractNum w:abstractNumId="10" w15:restartNumberingAfterBreak="0">
+    <w:nsid w:val="4C5F0B7D"/>
+    <w:multiLevelType w:val="hybridMultilevel"/>
+    <w:tmpl w:val="C9CE6292"/>
+    <w:lvl w:ilvl="0" w:tplc="240A0001">
+      <w:start w:val="1"/>
+      <w:numFmt w:val="bullet"/>
+      <w:lvlText w:val=""/>
+      <w:lvlJc w:val="left"/>
+      <w:pPr>
+        <w:ind w:left="1429" w:hanging="360"/>
+      </w:pPr>
+      <w:rPr>
+        <w:rFonts w:ascii="Symbol" w:hAnsi="Symbol" w:hint="default"/>
+      </w:rPr>
+    </w:lvl>
+    <w:lvl w:ilvl="1" w:tplc="240A0003" w:tentative="1">
+      <w:start w:val="1"/>
+      <w:numFmt w:val="bullet"/>
+      <w:lvlText w:val="o"/>
+      <w:lvlJc w:val="left"/>
+      <w:pPr>
+        <w:ind w:left="2149" w:hanging="360"/>
+      </w:pPr>
+      <w:rPr>
+        <w:rFonts w:ascii="Courier New" w:hAnsi="Courier New" w:cs="Courier New" w:hint="default"/>
+      </w:rPr>
+    </w:lvl>
+    <w:lvl w:ilvl="2" w:tplc="240A0005" w:tentative="1">
+      <w:start w:val="1"/>
+      <w:numFmt w:val="bullet"/>
+      <w:lvlText w:val=""/>
+      <w:lvlJc w:val="left"/>
+      <w:pPr>
+        <w:ind w:left="2869" w:hanging="360"/>
+      </w:pPr>
+      <w:rPr>
+        <w:rFonts w:ascii="Wingdings" w:hAnsi="Wingdings" w:hint="default"/>
+      </w:rPr>
+    </w:lvl>
+    <w:lvl w:ilvl="3" w:tplc="240A0001" w:tentative="1">
+      <w:start w:val="1"/>
+      <w:numFmt w:val="bullet"/>
+      <w:lvlText w:val=""/>
+      <w:lvlJc w:val="left"/>
+      <w:pPr>
+        <w:ind w:left="3589" w:hanging="360"/>
+      </w:pPr>
+      <w:rPr>
+        <w:rFonts w:ascii="Symbol" w:hAnsi="Symbol" w:hint="default"/>
+      </w:rPr>
+    </w:lvl>
+    <w:lvl w:ilvl="4" w:tplc="240A0003" w:tentative="1">
+      <w:start w:val="1"/>
+      <w:numFmt w:val="bullet"/>
+      <w:lvlText w:val="o"/>
+      <w:lvlJc w:val="left"/>
+      <w:pPr>
+        <w:ind w:left="4309" w:hanging="360"/>
+      </w:pPr>
+      <w:rPr>
+        <w:rFonts w:ascii="Courier New" w:hAnsi="Courier New" w:cs="Courier New" w:hint="default"/>
+      </w:rPr>
+    </w:lvl>
+    <w:lvl w:ilvl="5" w:tplc="240A0005" w:tentative="1">
+      <w:start w:val="1"/>
+      <w:numFmt w:val="bullet"/>
+      <w:lvlText w:val=""/>
+      <w:lvlJc w:val="left"/>
+      <w:pPr>
+        <w:ind w:left="5029" w:hanging="360"/>
+      </w:pPr>
+      <w:rPr>
+        <w:rFonts w:ascii="Wingdings" w:hAnsi="Wingdings" w:hint="default"/>
+      </w:rPr>
+    </w:lvl>
+    <w:lvl w:ilvl="6" w:tplc="240A0001" w:tentative="1">
+      <w:start w:val="1"/>
+      <w:numFmt w:val="bullet"/>
+      <w:lvlText w:val=""/>
+      <w:lvlJc w:val="left"/>
+      <w:pPr>
+        <w:ind w:left="5749" w:hanging="360"/>
+      </w:pPr>
+      <w:rPr>
+        <w:rFonts w:ascii="Symbol" w:hAnsi="Symbol" w:hint="default"/>
+      </w:rPr>
+    </w:lvl>
+    <w:lvl w:ilvl="7" w:tplc="240A0003" w:tentative="1">
+      <w:start w:val="1"/>
+      <w:numFmt w:val="bullet"/>
+      <w:lvlText w:val="o"/>
+      <w:lvlJc w:val="left"/>
+      <w:pPr>
+        <w:ind w:left="6469" w:hanging="360"/>
+      </w:pPr>
+      <w:rPr>
+        <w:rFonts w:ascii="Courier New" w:hAnsi="Courier New" w:cs="Courier New" w:hint="default"/>
+      </w:rPr>
+    </w:lvl>
+    <w:lvl w:ilvl="8" w:tplc="240A0005" w:tentative="1">
+      <w:start w:val="1"/>
+      <w:numFmt w:val="bullet"/>
+      <w:lvlText w:val=""/>
+      <w:lvlJc w:val="left"/>
+      <w:pPr>
+        <w:ind w:left="7189" w:hanging="360"/>
+      </w:pPr>
+      <w:rPr>
+        <w:rFonts w:ascii="Wingdings" w:hAnsi="Wingdings" w:hint="default"/>
+      </w:rPr>
+    </w:lvl>
+  </w:abstractNum>
+  <w:abstractNum w:abstractNumId="11" w15:restartNumberingAfterBreak="0">
     <w:nsid w:val="4EBE1EF6"/>
     <w:multiLevelType w:val="hybridMultilevel"/>
     <w:tmpl w:val="F6A60586"/>
@@ -14384,7 +14610,7 @@
       </w:pPr>
     </w:lvl>
   </w:abstractNum>
-  <w:abstractNum w:abstractNumId="11" w15:restartNumberingAfterBreak="0">
+  <w:abstractNum w:abstractNumId="12" w15:restartNumberingAfterBreak="0">
     <w:nsid w:val="548F28ED"/>
     <w:multiLevelType w:val="hybridMultilevel"/>
     <w:tmpl w:val="9C5865D0"/>
@@ -14497,7 +14723,7 @@
       </w:rPr>
     </w:lvl>
   </w:abstractNum>
-  <w:abstractNum w:abstractNumId="12" w15:restartNumberingAfterBreak="0">
+  <w:abstractNum w:abstractNumId="13" w15:restartNumberingAfterBreak="0">
     <w:nsid w:val="59BF5078"/>
     <w:multiLevelType w:val="multilevel"/>
     <w:tmpl w:val="78340210"/>
@@ -14622,7 +14848,7 @@
       </w:rPr>
     </w:lvl>
   </w:abstractNum>
-  <w:abstractNum w:abstractNumId="13" w15:restartNumberingAfterBreak="0">
+  <w:abstractNum w:abstractNumId="14" w15:restartNumberingAfterBreak="0">
     <w:nsid w:val="5E4F3C6D"/>
     <w:multiLevelType w:val="hybridMultilevel"/>
     <w:tmpl w:val="B6542D5A"/>
@@ -14735,7 +14961,7 @@
       </w:rPr>
     </w:lvl>
   </w:abstractNum>
-  <w:abstractNum w:abstractNumId="14" w15:restartNumberingAfterBreak="0">
+  <w:abstractNum w:abstractNumId="15" w15:restartNumberingAfterBreak="0">
     <w:nsid w:val="60FA282E"/>
     <w:multiLevelType w:val="hybridMultilevel"/>
     <w:tmpl w:val="DC041BB8"/>
@@ -14848,7 +15074,7 @@
       </w:rPr>
     </w:lvl>
   </w:abstractNum>
-  <w:abstractNum w:abstractNumId="15" w15:restartNumberingAfterBreak="0">
+  <w:abstractNum w:abstractNumId="16" w15:restartNumberingAfterBreak="0">
     <w:nsid w:val="744D7B0E"/>
     <w:multiLevelType w:val="hybridMultilevel"/>
     <w:tmpl w:val="288C041E"/>
@@ -14961,7 +15187,7 @@
       </w:rPr>
     </w:lvl>
   </w:abstractNum>
-  <w:abstractNum w:abstractNumId="16" w15:restartNumberingAfterBreak="0">
+  <w:abstractNum w:abstractNumId="17" w15:restartNumberingAfterBreak="0">
     <w:nsid w:val="749A7AB8"/>
     <w:multiLevelType w:val="hybridMultilevel"/>
     <w:tmpl w:val="547C8D66"/>
@@ -15074,7 +15300,7 @@
       </w:rPr>
     </w:lvl>
   </w:abstractNum>
-  <w:abstractNum w:abstractNumId="17" w15:restartNumberingAfterBreak="0">
+  <w:abstractNum w:abstractNumId="18" w15:restartNumberingAfterBreak="0">
     <w:nsid w:val="7BD73CA3"/>
     <w:multiLevelType w:val="hybridMultilevel"/>
     <w:tmpl w:val="E62A63CE"/>
@@ -15187,7 +15413,7 @@
       </w:rPr>
     </w:lvl>
   </w:abstractNum>
-  <w:abstractNum w:abstractNumId="18" w15:restartNumberingAfterBreak="0">
+  <w:abstractNum w:abstractNumId="19" w15:restartNumberingAfterBreak="0">
     <w:nsid w:val="7F1764FB"/>
     <w:multiLevelType w:val="hybridMultilevel"/>
     <w:tmpl w:val="8DA2FD6E"/>
@@ -15307,13 +15533,13 @@
     <w:abstractNumId w:val="3"/>
   </w:num>
   <w:num w:numId="3">
-    <w:abstractNumId w:val="10"/>
+    <w:abstractNumId w:val="11"/>
   </w:num>
   <w:num w:numId="4">
     <w:abstractNumId w:val="5"/>
   </w:num>
   <w:num w:numId="5">
-    <w:abstractNumId w:val="12"/>
+    <w:abstractNumId w:val="13"/>
   </w:num>
   <w:num w:numId="6">
     <w:abstractNumId w:val="2"/>
@@ -15322,40 +15548,43 @@
     <w:abstractNumId w:val="4"/>
   </w:num>
   <w:num w:numId="8">
-    <w:abstractNumId w:val="9"/>
+    <w:abstractNumId w:val="10"/>
   </w:num>
   <w:num w:numId="9">
-    <w:abstractNumId w:val="8"/>
+    <w:abstractNumId w:val="9"/>
   </w:num>
   <w:num w:numId="10">
     <w:abstractNumId w:val="7"/>
   </w:num>
   <w:num w:numId="11">
-    <w:abstractNumId w:val="18"/>
+    <w:abstractNumId w:val="19"/>
   </w:num>
   <w:num w:numId="12">
     <w:abstractNumId w:val="1"/>
   </w:num>
   <w:num w:numId="13">
+    <w:abstractNumId w:val="15"/>
+  </w:num>
+  <w:num w:numId="14">
     <w:abstractNumId w:val="14"/>
   </w:num>
-  <w:num w:numId="14">
-    <w:abstractNumId w:val="13"/>
-  </w:num>
   <w:num w:numId="15">
-    <w:abstractNumId w:val="16"/>
+    <w:abstractNumId w:val="17"/>
   </w:num>
   <w:num w:numId="16">
-    <w:abstractNumId w:val="17"/>
+    <w:abstractNumId w:val="18"/>
   </w:num>
   <w:num w:numId="17">
-    <w:abstractNumId w:val="15"/>
+    <w:abstractNumId w:val="16"/>
   </w:num>
   <w:num w:numId="18">
     <w:abstractNumId w:val="6"/>
   </w:num>
   <w:num w:numId="19">
-    <w:abstractNumId w:val="11"/>
+    <w:abstractNumId w:val="12"/>
+  </w:num>
+  <w:num w:numId="20">
+    <w:abstractNumId w:val="8"/>
   </w:num>
   <w:numIdMacAtCleanup w:val="17"/>
 </w:numbering>
@@ -16956,6 +17185,15 @@
 </file>
 
 <file path=customXml/item1.xml><?xml version="1.0" encoding="utf-8"?>
+<?mso-contentType ?>
+<FormTemplates xmlns="http://schemas.microsoft.com/sharepoint/v3/contenttype/forms">
+  <Display>DocumentLibraryForm</Display>
+  <Edit>DocumentLibraryForm</Edit>
+  <New>DocumentLibraryForm</New>
+</FormTemplates>
+</file>
+
+<file path=customXml/item2.xml><?xml version="1.0" encoding="utf-8"?>
 <ct:contentTypeSchema xmlns:ct="http://schemas.microsoft.com/office/2006/metadata/contentType" xmlns:ma="http://schemas.microsoft.com/office/2006/metadata/properties/metaAttributes" ct:_="" ma:_="" ma:contentTypeName="Documento" ma:contentTypeID="0x01010049282E1EDBE9234EA9E6D38F720E265F" ma:contentTypeVersion="15" ma:contentTypeDescription="Crear nuevo documento." ma:contentTypeScope="" ma:versionID="b31c7aa9eaf043a08b87120b3c4916e3">
   <xsd:schema xmlns:xsd="http://www.w3.org/2001/XMLSchema" xmlns:xs="http://www.w3.org/2001/XMLSchema" xmlns:p="http://schemas.microsoft.com/office/2006/metadata/properties" xmlns:ns2="cb45339b-ced9-4d0d-8f64-77573914d53b" xmlns:ns3="43a3ca16-9c26-4813-b83f-4aec9927b43f" targetNamespace="http://schemas.microsoft.com/office/2006/metadata/properties" ma:root="true" ma:fieldsID="3533d065b04d75c457075bc55f1f5315" ns2:_="" ns3:_="">
     <xsd:import namespace="cb45339b-ced9-4d0d-8f64-77573914d53b"/>
@@ -17190,16 +17428,11 @@
 </ct:contentTypeSchema>
 </file>
 
-<file path=customXml/item2.xml><?xml version="1.0" encoding="utf-8"?>
-<?mso-contentType ?>
-<FormTemplates xmlns="http://schemas.microsoft.com/sharepoint/v3/contenttype/forms">
-  <Display>DocumentLibraryForm</Display>
-  <Edit>DocumentLibraryForm</Edit>
-  <New>DocumentLibraryForm</New>
-</FormTemplates>
+<file path=customXml/item3.xml><?xml version="1.0" encoding="utf-8"?>
+<b:Sources xmlns:b="http://schemas.openxmlformats.org/officeDocument/2006/bibliography" xmlns="http://schemas.openxmlformats.org/officeDocument/2006/bibliography" SelectedStyle="\APASixthEditionOfficeOnline.xsl" StyleName="APA" Version="6"/>
 </file>
 
-<file path=customXml/item3.xml><?xml version="1.0" encoding="utf-8"?>
+<file path=customXml/item4.xml><?xml version="1.0" encoding="utf-8"?>
 <p:properties xmlns:p="http://schemas.microsoft.com/office/2006/metadata/properties" xmlns:xsi="http://www.w3.org/2001/XMLSchema-instance" xmlns:pc="http://schemas.microsoft.com/office/infopath/2007/PartnerControls">
   <documentManagement>
     <TaxCatchAll xmlns="cb45339b-ced9-4d0d-8f64-77573914d53b"/>
@@ -17210,11 +17443,15 @@
 </p:properties>
 </file>
 
-<file path=customXml/item4.xml><?xml version="1.0" encoding="utf-8"?>
-<b:Sources xmlns:b="http://schemas.openxmlformats.org/officeDocument/2006/bibliography" xmlns="http://schemas.openxmlformats.org/officeDocument/2006/bibliography" SelectedStyle="\APASixthEditionOfficeOnline.xsl" StyleName="APA" Version="6"/>
+<file path=customXml/itemProps1.xml><?xml version="1.0" encoding="utf-8"?>
+<ds:datastoreItem xmlns:ds="http://schemas.openxmlformats.org/officeDocument/2006/customXml" ds:itemID="{81CBDEC1-3B00-44ED-AD36-0268077980BA}">
+  <ds:schemaRefs>
+    <ds:schemaRef ds:uri="http://schemas.microsoft.com/sharepoint/v3/contenttype/forms"/>
+  </ds:schemaRefs>
+</ds:datastoreItem>
 </file>
 
-<file path=customXml/itemProps1.xml><?xml version="1.0" encoding="utf-8"?>
+<file path=customXml/itemProps2.xml><?xml version="1.0" encoding="utf-8"?>
 <ds:datastoreItem xmlns:ds="http://schemas.openxmlformats.org/officeDocument/2006/customXml" ds:itemID="{DF43E046-DB0C-42D1-8C73-AE38B52F1ED7}">
   <ds:schemaRefs>
     <ds:schemaRef ds:uri="http://schemas.microsoft.com/office/2006/metadata/contentType"/>
@@ -17233,15 +17470,15 @@
 </ds:datastoreItem>
 </file>
 
-<file path=customXml/itemProps2.xml><?xml version="1.0" encoding="utf-8"?>
-<ds:datastoreItem xmlns:ds="http://schemas.openxmlformats.org/officeDocument/2006/customXml" ds:itemID="{81CBDEC1-3B00-44ED-AD36-0268077980BA}">
+<file path=customXml/itemProps3.xml><?xml version="1.0" encoding="utf-8"?>
+<ds:datastoreItem xmlns:ds="http://schemas.openxmlformats.org/officeDocument/2006/customXml" ds:itemID="{E8AB44A3-7C62-4BD2-82ED-8ABC209970FA}">
   <ds:schemaRefs>
-    <ds:schemaRef ds:uri="http://schemas.microsoft.com/sharepoint/v3/contenttype/forms"/>
+    <ds:schemaRef ds:uri="http://schemas.openxmlformats.org/officeDocument/2006/bibliography"/>
   </ds:schemaRefs>
 </ds:datastoreItem>
 </file>
 
-<file path=customXml/itemProps3.xml><?xml version="1.0" encoding="utf-8"?>
+<file path=customXml/itemProps4.xml><?xml version="1.0" encoding="utf-8"?>
 <ds:datastoreItem xmlns:ds="http://schemas.openxmlformats.org/officeDocument/2006/customXml" ds:itemID="{1145D752-ACC1-45E1-AB53-0C756F67FC7F}">
   <ds:schemaRefs>
     <ds:schemaRef ds:uri="http://schemas.microsoft.com/office/2006/metadata/properties"/>
@@ -17250,12 +17487,4 @@
     <ds:schemaRef ds:uri="43a3ca16-9c26-4813-b83f-4aec9927b43f"/>
   </ds:schemaRefs>
 </ds:datastoreItem>
-</file>
-
-<file path=customXml/itemProps4.xml><?xml version="1.0" encoding="utf-8"?>
-<ds:datastoreItem xmlns:ds="http://schemas.openxmlformats.org/officeDocument/2006/customXml" ds:itemID="{E8AB44A3-7C62-4BD2-82ED-8ABC209970FA}">
-  <ds:schemaRefs>
-    <ds:schemaRef ds:uri="http://schemas.openxmlformats.org/officeDocument/2006/bibliography"/>
-  </ds:schemaRefs>
-</ds:datastoreItem>
 </file>
</xml_diff>